<commit_message>
Update SEL teaching resources and notes
</commit_message>
<xml_diff>
--- a/docx/SEL學習單_可編輯A4黑白版.docx
+++ b/docx/SEL學習單_可編輯A4黑白版.docx
@@ -1173,6 +1173,2381 @@
         <w:spacing w:after="40"/>
       </w:pPr>
     </w:p>
+    <w:p>
+      <w:r>
+        <w:br w:type="page"/>
+      </w:r>
+    </w:p>
+    <w:p>
+      <w:pPr>
+        <w:pStyle w:val="Heading1"/>
+      </w:pPr>
+      <w:r>
+        <w:t>人際回應卡</w:t>
+      </w:r>
+    </w:p>
+    <w:p>
+      <w:r>
+        <w:rPr>
+          <w:rFonts w:ascii="Microsoft JhengHei" w:hAnsi="Microsoft JhengHei" w:eastAsia="Microsoft JhengHei"/>
+          <w:b w:val="0"/>
+          <w:color w:val="000000"/>
+          <w:sz w:val="28"/>
+        </w:rPr>
+        <w:t>練習表達感受、說出界線，也保留彼此選擇的空間。</w:t>
+      </w:r>
+    </w:p>
+    <w:tbl>
+      <w:tblPr>
+        <w:tblW w:type="auto" w:w="0"/>
+        <w:jc w:val="center"/>
+        <w:tblLayout w:type="fixed"/>
+        <w:tblLook w:firstColumn="1" w:firstRow="1" w:lastColumn="0" w:lastRow="0" w:noHBand="0" w:noVBand="1" w:val="04A0"/>
+      </w:tblPr>
+      <w:tblGrid>
+        <w:gridCol w:w="4989"/>
+        <w:gridCol w:w="4989"/>
+      </w:tblGrid>
+      <w:tr>
+        <w:tc>
+          <w:tcPr>
+            <w:tcW w:type="dxa" w:w="4989"/>
+            <w:tcBorders>
+              <w:top w:val="single" w:sz="10" w:space="0" w:color="000000"/>
+              <w:left w:val="single" w:sz="10" w:space="0" w:color="000000"/>
+              <w:bottom w:val="single" w:sz="10" w:space="0" w:color="000000"/>
+              <w:right w:val="single" w:sz="10" w:space="0" w:color="000000"/>
+              <w:insideH w:val="single" w:sz="10" w:space="0" w:color="000000"/>
+              <w:insideV w:val="single" w:sz="10" w:space="0" w:color="000000"/>
+            </w:tcBorders>
+            <w:shd w:fill="F2F2F2"/>
+            <w:tcMar>
+              <w:top w:w="110" w:type="dxa"/>
+              <w:start w:w="120" w:type="dxa"/>
+              <w:bottom w:w="110" w:type="dxa"/>
+              <w:end w:w="120" w:type="dxa"/>
+            </w:tcMar>
+            <w:vAlign w:val="center"/>
+          </w:tcPr>
+          <w:p>
+            <w:pPr>
+              <w:jc w:val="center"/>
+            </w:pPr>
+            <w:r>
+              <w:rPr>
+                <w:rFonts w:ascii="Microsoft JhengHei" w:hAnsi="Microsoft JhengHei" w:eastAsia="Microsoft JhengHei"/>
+                <w:b/>
+                <w:color w:val="000000"/>
+                <w:sz w:val="28"/>
+              </w:rPr>
+              <w:t>我觀察到的情境</w:t>
+            </w:r>
+          </w:p>
+        </w:tc>
+        <w:tc>
+          <w:tcPr>
+            <w:tcW w:type="dxa" w:w="4989"/>
+            <w:tcBorders>
+              <w:top w:val="single" w:sz="10" w:space="0" w:color="000000"/>
+              <w:left w:val="single" w:sz="10" w:space="0" w:color="000000"/>
+              <w:bottom w:val="single" w:sz="10" w:space="0" w:color="000000"/>
+              <w:right w:val="single" w:sz="10" w:space="0" w:color="000000"/>
+              <w:insideH w:val="single" w:sz="10" w:space="0" w:color="000000"/>
+              <w:insideV w:val="single" w:sz="10" w:space="0" w:color="000000"/>
+            </w:tcBorders>
+            <w:shd w:fill="F2F2F2"/>
+            <w:tcMar>
+              <w:top w:w="110" w:type="dxa"/>
+              <w:start w:w="120" w:type="dxa"/>
+              <w:bottom w:w="110" w:type="dxa"/>
+              <w:end w:w="120" w:type="dxa"/>
+            </w:tcMar>
+            <w:vAlign w:val="center"/>
+          </w:tcPr>
+          <w:p>
+            <w:pPr>
+              <w:jc w:val="center"/>
+            </w:pPr>
+            <w:r>
+              <w:rPr>
+                <w:rFonts w:ascii="Microsoft JhengHei" w:hAnsi="Microsoft JhengHei" w:eastAsia="Microsoft JhengHei"/>
+                <w:b/>
+                <w:color w:val="000000"/>
+                <w:sz w:val="28"/>
+              </w:rPr>
+              <w:t>我的記錄</w:t>
+            </w:r>
+          </w:p>
+        </w:tc>
+      </w:tr>
+      <w:tr>
+        <w:tc>
+          <w:tcPr>
+            <w:tcW w:type="dxa" w:w="4989"/>
+            <w:tcBorders>
+              <w:top w:val="single" w:sz="10" w:space="0" w:color="000000"/>
+              <w:left w:val="single" w:sz="10" w:space="0" w:color="000000"/>
+              <w:bottom w:val="single" w:sz="10" w:space="0" w:color="000000"/>
+              <w:right w:val="single" w:sz="10" w:space="0" w:color="000000"/>
+              <w:insideH w:val="single" w:sz="10" w:space="0" w:color="000000"/>
+              <w:insideV w:val="single" w:sz="10" w:space="0" w:color="000000"/>
+            </w:tcBorders>
+            <w:shd w:fill="FFFFFF"/>
+            <w:tcMar>
+              <w:top w:w="130" w:type="dxa"/>
+              <w:start w:w="120" w:type="dxa"/>
+              <w:bottom w:w="130" w:type="dxa"/>
+              <w:end w:w="120" w:type="dxa"/>
+            </w:tcMar>
+            <w:vAlign w:val="center"/>
+          </w:tcPr>
+          <w:p>
+            <w:pPr>
+              <w:jc w:val="left"/>
+            </w:pPr>
+            <w:r>
+              <w:rPr>
+                <w:rFonts w:ascii="Microsoft JhengHei" w:hAnsi="Microsoft JhengHei" w:eastAsia="Microsoft JhengHei"/>
+                <w:b w:val="0"/>
+                <w:color w:val="000000"/>
+                <w:sz w:val="28"/>
+              </w:rPr>
+              <w:t>發生了什麼？</w:t>
+            </w:r>
+          </w:p>
+        </w:tc>
+        <w:tc>
+          <w:tcPr>
+            <w:tcW w:type="dxa" w:w="4989"/>
+            <w:tcBorders>
+              <w:top w:val="single" w:sz="10" w:space="0" w:color="000000"/>
+              <w:left w:val="single" w:sz="10" w:space="0" w:color="000000"/>
+              <w:bottom w:val="single" w:sz="10" w:space="0" w:color="000000"/>
+              <w:right w:val="single" w:sz="10" w:space="0" w:color="000000"/>
+              <w:insideH w:val="single" w:sz="10" w:space="0" w:color="000000"/>
+              <w:insideV w:val="single" w:sz="10" w:space="0" w:color="000000"/>
+            </w:tcBorders>
+            <w:shd w:fill="FFFFFF"/>
+            <w:tcMar>
+              <w:top w:w="130" w:type="dxa"/>
+              <w:start w:w="120" w:type="dxa"/>
+              <w:bottom w:w="130" w:type="dxa"/>
+              <w:end w:w="120" w:type="dxa"/>
+            </w:tcMar>
+            <w:vAlign w:val="center"/>
+          </w:tcPr>
+          <w:p>
+            <w:pPr>
+              <w:jc w:val="left"/>
+            </w:pPr>
+            <w:r>
+              <w:rPr>
+                <w:rFonts w:ascii="Microsoft JhengHei" w:hAnsi="Microsoft JhengHei" w:eastAsia="Microsoft JhengHei"/>
+                <w:b w:val="0"/>
+                <w:color w:val="000000"/>
+                <w:sz w:val="28"/>
+              </w:rPr>
+              <w:t>________________________________</w:t>
+            </w:r>
+          </w:p>
+        </w:tc>
+      </w:tr>
+      <w:tr>
+        <w:tc>
+          <w:tcPr>
+            <w:tcW w:type="dxa" w:w="4989"/>
+            <w:tcBorders>
+              <w:top w:val="single" w:sz="10" w:space="0" w:color="000000"/>
+              <w:left w:val="single" w:sz="10" w:space="0" w:color="000000"/>
+              <w:bottom w:val="single" w:sz="10" w:space="0" w:color="000000"/>
+              <w:right w:val="single" w:sz="10" w:space="0" w:color="000000"/>
+              <w:insideH w:val="single" w:sz="10" w:space="0" w:color="000000"/>
+              <w:insideV w:val="single" w:sz="10" w:space="0" w:color="000000"/>
+            </w:tcBorders>
+            <w:shd w:fill="FFFFFF"/>
+            <w:tcMar>
+              <w:top w:w="130" w:type="dxa"/>
+              <w:start w:w="120" w:type="dxa"/>
+              <w:bottom w:w="130" w:type="dxa"/>
+              <w:end w:w="120" w:type="dxa"/>
+            </w:tcMar>
+            <w:vAlign w:val="center"/>
+          </w:tcPr>
+          <w:p>
+            <w:pPr>
+              <w:jc w:val="left"/>
+            </w:pPr>
+            <w:r>
+              <w:rPr>
+                <w:rFonts w:ascii="Microsoft JhengHei" w:hAnsi="Microsoft JhengHei" w:eastAsia="Microsoft JhengHei"/>
+                <w:b w:val="0"/>
+                <w:color w:val="000000"/>
+                <w:sz w:val="28"/>
+              </w:rPr>
+              <w:t>我的感受是什麼？</w:t>
+            </w:r>
+          </w:p>
+        </w:tc>
+        <w:tc>
+          <w:tcPr>
+            <w:tcW w:type="dxa" w:w="4989"/>
+            <w:tcBorders>
+              <w:top w:val="single" w:sz="10" w:space="0" w:color="000000"/>
+              <w:left w:val="single" w:sz="10" w:space="0" w:color="000000"/>
+              <w:bottom w:val="single" w:sz="10" w:space="0" w:color="000000"/>
+              <w:right w:val="single" w:sz="10" w:space="0" w:color="000000"/>
+              <w:insideH w:val="single" w:sz="10" w:space="0" w:color="000000"/>
+              <w:insideV w:val="single" w:sz="10" w:space="0" w:color="000000"/>
+            </w:tcBorders>
+            <w:shd w:fill="FFFFFF"/>
+            <w:tcMar>
+              <w:top w:w="130" w:type="dxa"/>
+              <w:start w:w="120" w:type="dxa"/>
+              <w:bottom w:w="130" w:type="dxa"/>
+              <w:end w:w="120" w:type="dxa"/>
+            </w:tcMar>
+            <w:vAlign w:val="center"/>
+          </w:tcPr>
+          <w:p>
+            <w:pPr>
+              <w:jc w:val="left"/>
+            </w:pPr>
+            <w:r>
+              <w:rPr>
+                <w:rFonts w:ascii="Microsoft JhengHei" w:hAnsi="Microsoft JhengHei" w:eastAsia="Microsoft JhengHei"/>
+                <w:b w:val="0"/>
+                <w:color w:val="000000"/>
+                <w:sz w:val="28"/>
+              </w:rPr>
+              <w:t>________________________________</w:t>
+            </w:r>
+          </w:p>
+        </w:tc>
+      </w:tr>
+      <w:tr>
+        <w:tc>
+          <w:tcPr>
+            <w:tcW w:type="dxa" w:w="4989"/>
+            <w:tcBorders>
+              <w:top w:val="single" w:sz="10" w:space="0" w:color="000000"/>
+              <w:left w:val="single" w:sz="10" w:space="0" w:color="000000"/>
+              <w:bottom w:val="single" w:sz="10" w:space="0" w:color="000000"/>
+              <w:right w:val="single" w:sz="10" w:space="0" w:color="000000"/>
+              <w:insideH w:val="single" w:sz="10" w:space="0" w:color="000000"/>
+              <w:insideV w:val="single" w:sz="10" w:space="0" w:color="000000"/>
+            </w:tcBorders>
+            <w:shd w:fill="FFFFFF"/>
+            <w:tcMar>
+              <w:top w:w="130" w:type="dxa"/>
+              <w:start w:w="120" w:type="dxa"/>
+              <w:bottom w:w="130" w:type="dxa"/>
+              <w:end w:w="120" w:type="dxa"/>
+            </w:tcMar>
+            <w:vAlign w:val="center"/>
+          </w:tcPr>
+          <w:p>
+            <w:pPr>
+              <w:jc w:val="left"/>
+            </w:pPr>
+            <w:r>
+              <w:rPr>
+                <w:rFonts w:ascii="Microsoft JhengHei" w:hAnsi="Microsoft JhengHei" w:eastAsia="Microsoft JhengHei"/>
+                <w:b w:val="0"/>
+                <w:color w:val="000000"/>
+                <w:sz w:val="28"/>
+              </w:rPr>
+              <w:t>我想守住的界線：</w:t>
+            </w:r>
+          </w:p>
+        </w:tc>
+        <w:tc>
+          <w:tcPr>
+            <w:tcW w:type="dxa" w:w="4989"/>
+            <w:tcBorders>
+              <w:top w:val="single" w:sz="10" w:space="0" w:color="000000"/>
+              <w:left w:val="single" w:sz="10" w:space="0" w:color="000000"/>
+              <w:bottom w:val="single" w:sz="10" w:space="0" w:color="000000"/>
+              <w:right w:val="single" w:sz="10" w:space="0" w:color="000000"/>
+              <w:insideH w:val="single" w:sz="10" w:space="0" w:color="000000"/>
+              <w:insideV w:val="single" w:sz="10" w:space="0" w:color="000000"/>
+            </w:tcBorders>
+            <w:shd w:fill="FFFFFF"/>
+            <w:tcMar>
+              <w:top w:w="130" w:type="dxa"/>
+              <w:start w:w="120" w:type="dxa"/>
+              <w:bottom w:w="130" w:type="dxa"/>
+              <w:end w:w="120" w:type="dxa"/>
+            </w:tcMar>
+            <w:vAlign w:val="center"/>
+          </w:tcPr>
+          <w:p>
+            <w:pPr>
+              <w:jc w:val="left"/>
+            </w:pPr>
+            <w:r>
+              <w:rPr>
+                <w:rFonts w:ascii="Microsoft JhengHei" w:hAnsi="Microsoft JhengHei" w:eastAsia="Microsoft JhengHei"/>
+                <w:b w:val="0"/>
+                <w:color w:val="000000"/>
+                <w:sz w:val="28"/>
+              </w:rPr>
+              <w:t>________________________________</w:t>
+            </w:r>
+          </w:p>
+        </w:tc>
+      </w:tr>
+      <w:tr>
+        <w:tc>
+          <w:tcPr>
+            <w:tcW w:type="dxa" w:w="4989"/>
+            <w:tcBorders>
+              <w:top w:val="single" w:sz="10" w:space="0" w:color="000000"/>
+              <w:left w:val="single" w:sz="10" w:space="0" w:color="000000"/>
+              <w:bottom w:val="single" w:sz="10" w:space="0" w:color="000000"/>
+              <w:right w:val="single" w:sz="10" w:space="0" w:color="000000"/>
+              <w:insideH w:val="single" w:sz="10" w:space="0" w:color="000000"/>
+              <w:insideV w:val="single" w:sz="10" w:space="0" w:color="000000"/>
+            </w:tcBorders>
+            <w:shd w:fill="FFFFFF"/>
+            <w:tcMar>
+              <w:top w:w="130" w:type="dxa"/>
+              <w:start w:w="120" w:type="dxa"/>
+              <w:bottom w:w="130" w:type="dxa"/>
+              <w:end w:w="120" w:type="dxa"/>
+            </w:tcMar>
+            <w:vAlign w:val="center"/>
+          </w:tcPr>
+          <w:p>
+            <w:pPr>
+              <w:jc w:val="left"/>
+            </w:pPr>
+            <w:r>
+              <w:rPr>
+                <w:rFonts w:ascii="Microsoft JhengHei" w:hAnsi="Microsoft JhengHei" w:eastAsia="Microsoft JhengHei"/>
+                <w:b w:val="0"/>
+                <w:color w:val="000000"/>
+                <w:sz w:val="28"/>
+              </w:rPr>
+              <w:t>我可以說：</w:t>
+            </w:r>
+          </w:p>
+        </w:tc>
+        <w:tc>
+          <w:tcPr>
+            <w:tcW w:type="dxa" w:w="4989"/>
+            <w:tcBorders>
+              <w:top w:val="single" w:sz="10" w:space="0" w:color="000000"/>
+              <w:left w:val="single" w:sz="10" w:space="0" w:color="000000"/>
+              <w:bottom w:val="single" w:sz="10" w:space="0" w:color="000000"/>
+              <w:right w:val="single" w:sz="10" w:space="0" w:color="000000"/>
+              <w:insideH w:val="single" w:sz="10" w:space="0" w:color="000000"/>
+              <w:insideV w:val="single" w:sz="10" w:space="0" w:color="000000"/>
+            </w:tcBorders>
+            <w:shd w:fill="FFFFFF"/>
+            <w:tcMar>
+              <w:top w:w="130" w:type="dxa"/>
+              <w:start w:w="120" w:type="dxa"/>
+              <w:bottom w:w="130" w:type="dxa"/>
+              <w:end w:w="120" w:type="dxa"/>
+            </w:tcMar>
+            <w:vAlign w:val="center"/>
+          </w:tcPr>
+          <w:p>
+            <w:pPr>
+              <w:jc w:val="left"/>
+            </w:pPr>
+            <w:r>
+              <w:rPr>
+                <w:rFonts w:ascii="Microsoft JhengHei" w:hAnsi="Microsoft JhengHei" w:eastAsia="Microsoft JhengHei"/>
+                <w:b w:val="0"/>
+                <w:color w:val="000000"/>
+                <w:sz w:val="28"/>
+              </w:rPr>
+              <w:t>我感到________，我希望________。</w:t>
+            </w:r>
+          </w:p>
+        </w:tc>
+      </w:tr>
+      <w:tr>
+        <w:tc>
+          <w:tcPr>
+            <w:tcW w:type="dxa" w:w="4989"/>
+            <w:tcBorders>
+              <w:top w:val="single" w:sz="10" w:space="0" w:color="000000"/>
+              <w:left w:val="single" w:sz="10" w:space="0" w:color="000000"/>
+              <w:bottom w:val="single" w:sz="10" w:space="0" w:color="000000"/>
+              <w:right w:val="single" w:sz="10" w:space="0" w:color="000000"/>
+              <w:insideH w:val="single" w:sz="10" w:space="0" w:color="000000"/>
+              <w:insideV w:val="single" w:sz="10" w:space="0" w:color="000000"/>
+            </w:tcBorders>
+            <w:shd w:fill="FFFFFF"/>
+            <w:tcMar>
+              <w:top w:w="130" w:type="dxa"/>
+              <w:start w:w="120" w:type="dxa"/>
+              <w:bottom w:w="130" w:type="dxa"/>
+              <w:end w:w="120" w:type="dxa"/>
+            </w:tcMar>
+            <w:vAlign w:val="center"/>
+          </w:tcPr>
+          <w:p>
+            <w:pPr>
+              <w:jc w:val="left"/>
+            </w:pPr>
+            <w:r>
+              <w:rPr>
+                <w:rFonts w:ascii="Microsoft JhengHei" w:hAnsi="Microsoft JhengHei" w:eastAsia="Microsoft JhengHei"/>
+                <w:b w:val="0"/>
+                <w:color w:val="000000"/>
+                <w:sz w:val="28"/>
+              </w:rPr>
+              <w:t>如果對方不同意，我可以：</w:t>
+            </w:r>
+          </w:p>
+        </w:tc>
+        <w:tc>
+          <w:tcPr>
+            <w:tcW w:type="dxa" w:w="4989"/>
+            <w:tcBorders>
+              <w:top w:val="single" w:sz="10" w:space="0" w:color="000000"/>
+              <w:left w:val="single" w:sz="10" w:space="0" w:color="000000"/>
+              <w:bottom w:val="single" w:sz="10" w:space="0" w:color="000000"/>
+              <w:right w:val="single" w:sz="10" w:space="0" w:color="000000"/>
+              <w:insideH w:val="single" w:sz="10" w:space="0" w:color="000000"/>
+              <w:insideV w:val="single" w:sz="10" w:space="0" w:color="000000"/>
+            </w:tcBorders>
+            <w:shd w:fill="FFFFFF"/>
+            <w:tcMar>
+              <w:top w:w="130" w:type="dxa"/>
+              <w:start w:w="120" w:type="dxa"/>
+              <w:bottom w:w="130" w:type="dxa"/>
+              <w:end w:w="120" w:type="dxa"/>
+            </w:tcMar>
+            <w:vAlign w:val="center"/>
+          </w:tcPr>
+          <w:p>
+            <w:pPr>
+              <w:jc w:val="left"/>
+            </w:pPr>
+            <w:r>
+              <w:rPr>
+                <w:rFonts w:ascii="Microsoft JhengHei" w:hAnsi="Microsoft JhengHei" w:eastAsia="Microsoft JhengHei"/>
+                <w:b w:val="0"/>
+                <w:color w:val="000000"/>
+                <w:sz w:val="28"/>
+              </w:rPr>
+              <w:t>□ 暫停　□ 協商　□ 找可信任的大人</w:t>
+            </w:r>
+          </w:p>
+        </w:tc>
+      </w:tr>
+    </w:tbl>
+    <w:p/>
+    <w:tbl>
+      <w:tblPr>
+        <w:tblW w:type="auto" w:w="0"/>
+        <w:jc w:val="center"/>
+        <w:tblLayout w:type="fixed"/>
+        <w:tblLook w:firstColumn="1" w:firstRow="1" w:lastColumn="0" w:lastRow="0" w:noHBand="0" w:noVBand="1" w:val="04A0"/>
+      </w:tblPr>
+      <w:tblGrid>
+        <w:gridCol w:w="9978"/>
+      </w:tblGrid>
+      <w:tr>
+        <w:tc>
+          <w:tcPr>
+            <w:tcW w:type="dxa" w:w="9978"/>
+            <w:tcBorders>
+              <w:top w:val="single" w:sz="10" w:space="0" w:color="000000"/>
+              <w:left w:val="single" w:sz="10" w:space="0" w:color="000000"/>
+              <w:bottom w:val="single" w:sz="10" w:space="0" w:color="000000"/>
+              <w:right w:val="single" w:sz="10" w:space="0" w:color="000000"/>
+              <w:insideH w:val="single" w:sz="10" w:space="0" w:color="000000"/>
+              <w:insideV w:val="single" w:sz="10" w:space="0" w:color="000000"/>
+            </w:tcBorders>
+            <w:shd w:fill="FFFFFF"/>
+            <w:tcMar>
+              <w:top w:w="160" w:type="dxa"/>
+              <w:start w:w="180" w:type="dxa"/>
+              <w:bottom w:w="160" w:type="dxa"/>
+              <w:end w:w="180" w:type="dxa"/>
+            </w:tcMar>
+            <w:vAlign w:val="center"/>
+          </w:tcPr>
+          <w:p>
+            <w:pPr>
+              <w:spacing w:after="160"/>
+            </w:pPr>
+            <w:r>
+              <w:rPr>
+                <w:rFonts w:ascii="Microsoft JhengHei" w:hAnsi="Microsoft JhengHei" w:eastAsia="Microsoft JhengHei"/>
+                <w:b/>
+                <w:color w:val="000000"/>
+                <w:sz w:val="32"/>
+              </w:rPr>
+              <w:t>我願意聽見對方的地方</w:t>
+            </w:r>
+          </w:p>
+          <w:p>
+            <w:pPr>
+              <w:spacing w:after="120"/>
+            </w:pPr>
+            <w:r>
+              <w:rPr>
+                <w:rFonts w:ascii="Microsoft JhengHei" w:hAnsi="Microsoft JhengHei" w:eastAsia="Microsoft JhengHei"/>
+                <w:b w:val="0"/>
+                <w:color w:val="000000"/>
+                <w:sz w:val="28"/>
+              </w:rPr>
+              <w:t>________________________________________________________________________________</w:t>
+            </w:r>
+          </w:p>
+          <w:p>
+            <w:pPr>
+              <w:spacing w:after="120"/>
+            </w:pPr>
+            <w:r>
+              <w:rPr>
+                <w:rFonts w:ascii="Microsoft JhengHei" w:hAnsi="Microsoft JhengHei" w:eastAsia="Microsoft JhengHei"/>
+                <w:b w:val="0"/>
+                <w:color w:val="000000"/>
+                <w:sz w:val="28"/>
+              </w:rPr>
+              <w:t>________________________________________________________________________________</w:t>
+            </w:r>
+          </w:p>
+          <w:p>
+            <w:pPr>
+              <w:spacing w:after="120"/>
+            </w:pPr>
+            <w:r>
+              <w:rPr>
+                <w:rFonts w:ascii="Microsoft JhengHei" w:hAnsi="Microsoft JhengHei" w:eastAsia="Microsoft JhengHei"/>
+                <w:b w:val="0"/>
+                <w:color w:val="000000"/>
+                <w:sz w:val="28"/>
+              </w:rPr>
+              <w:t>________________________________________________________________________________</w:t>
+            </w:r>
+          </w:p>
+        </w:tc>
+      </w:tr>
+    </w:tbl>
+    <w:p>
+      <w:pPr>
+        <w:spacing w:after="40"/>
+      </w:pPr>
+    </w:p>
+    <w:p>
+      <w:r>
+        <w:br w:type="page"/>
+      </w:r>
+    </w:p>
+    <w:p>
+      <w:pPr>
+        <w:pStyle w:val="Heading1"/>
+      </w:pPr>
+      <w:r>
+        <w:t>網路資訊檢核表</w:t>
+      </w:r>
+    </w:p>
+    <w:p>
+      <w:r>
+        <w:rPr>
+          <w:rFonts w:ascii="Microsoft JhengHei" w:hAnsi="Microsoft JhengHei" w:eastAsia="Microsoft JhengHei"/>
+          <w:b w:val="0"/>
+          <w:color w:val="000000"/>
+          <w:sz w:val="28"/>
+        </w:rPr>
+        <w:t>看到消息、連結或照片時，先停一下，再決定是否相信、回應或轉傳。</w:t>
+      </w:r>
+    </w:p>
+    <w:tbl>
+      <w:tblPr>
+        <w:tblW w:type="auto" w:w="0"/>
+        <w:jc w:val="center"/>
+        <w:tblLayout w:type="fixed"/>
+        <w:tblLook w:firstColumn="1" w:firstRow="1" w:lastColumn="0" w:lastRow="0" w:noHBand="0" w:noVBand="1" w:val="04A0"/>
+      </w:tblPr>
+      <w:tblGrid>
+        <w:gridCol w:w="4989"/>
+        <w:gridCol w:w="4989"/>
+      </w:tblGrid>
+      <w:tr>
+        <w:tc>
+          <w:tcPr>
+            <w:tcW w:type="dxa" w:w="4989"/>
+            <w:tcBorders>
+              <w:top w:val="single" w:sz="10" w:space="0" w:color="000000"/>
+              <w:left w:val="single" w:sz="10" w:space="0" w:color="000000"/>
+              <w:bottom w:val="single" w:sz="10" w:space="0" w:color="000000"/>
+              <w:right w:val="single" w:sz="10" w:space="0" w:color="000000"/>
+              <w:insideH w:val="single" w:sz="10" w:space="0" w:color="000000"/>
+              <w:insideV w:val="single" w:sz="10" w:space="0" w:color="000000"/>
+            </w:tcBorders>
+            <w:shd w:fill="F2F2F2"/>
+            <w:tcMar>
+              <w:top w:w="110" w:type="dxa"/>
+              <w:start w:w="120" w:type="dxa"/>
+              <w:bottom w:w="110" w:type="dxa"/>
+              <w:end w:w="120" w:type="dxa"/>
+            </w:tcMar>
+            <w:vAlign w:val="center"/>
+          </w:tcPr>
+          <w:p>
+            <w:pPr>
+              <w:jc w:val="center"/>
+            </w:pPr>
+            <w:r>
+              <w:rPr>
+                <w:rFonts w:ascii="Microsoft JhengHei" w:hAnsi="Microsoft JhengHei" w:eastAsia="Microsoft JhengHei"/>
+                <w:b/>
+                <w:color w:val="000000"/>
+                <w:sz w:val="28"/>
+              </w:rPr>
+              <w:t>檢核線索</w:t>
+            </w:r>
+          </w:p>
+        </w:tc>
+        <w:tc>
+          <w:tcPr>
+            <w:tcW w:type="dxa" w:w="4989"/>
+            <w:tcBorders>
+              <w:top w:val="single" w:sz="10" w:space="0" w:color="000000"/>
+              <w:left w:val="single" w:sz="10" w:space="0" w:color="000000"/>
+              <w:bottom w:val="single" w:sz="10" w:space="0" w:color="000000"/>
+              <w:right w:val="single" w:sz="10" w:space="0" w:color="000000"/>
+              <w:insideH w:val="single" w:sz="10" w:space="0" w:color="000000"/>
+              <w:insideV w:val="single" w:sz="10" w:space="0" w:color="000000"/>
+            </w:tcBorders>
+            <w:shd w:fill="F2F2F2"/>
+            <w:tcMar>
+              <w:top w:w="110" w:type="dxa"/>
+              <w:start w:w="120" w:type="dxa"/>
+              <w:bottom w:w="110" w:type="dxa"/>
+              <w:end w:w="120" w:type="dxa"/>
+            </w:tcMar>
+            <w:vAlign w:val="center"/>
+          </w:tcPr>
+          <w:p>
+            <w:pPr>
+              <w:jc w:val="center"/>
+            </w:pPr>
+            <w:r>
+              <w:rPr>
+                <w:rFonts w:ascii="Microsoft JhengHei" w:hAnsi="Microsoft JhengHei" w:eastAsia="Microsoft JhengHei"/>
+                <w:b/>
+                <w:color w:val="000000"/>
+                <w:sz w:val="28"/>
+              </w:rPr>
+              <w:t>我查到的內容</w:t>
+            </w:r>
+          </w:p>
+        </w:tc>
+      </w:tr>
+      <w:tr>
+        <w:tc>
+          <w:tcPr>
+            <w:tcW w:type="dxa" w:w="4989"/>
+            <w:tcBorders>
+              <w:top w:val="single" w:sz="10" w:space="0" w:color="000000"/>
+              <w:left w:val="single" w:sz="10" w:space="0" w:color="000000"/>
+              <w:bottom w:val="single" w:sz="10" w:space="0" w:color="000000"/>
+              <w:right w:val="single" w:sz="10" w:space="0" w:color="000000"/>
+              <w:insideH w:val="single" w:sz="10" w:space="0" w:color="000000"/>
+              <w:insideV w:val="single" w:sz="10" w:space="0" w:color="000000"/>
+            </w:tcBorders>
+            <w:shd w:fill="FFFFFF"/>
+            <w:tcMar>
+              <w:top w:w="130" w:type="dxa"/>
+              <w:start w:w="120" w:type="dxa"/>
+              <w:bottom w:w="130" w:type="dxa"/>
+              <w:end w:w="120" w:type="dxa"/>
+            </w:tcMar>
+            <w:vAlign w:val="center"/>
+          </w:tcPr>
+          <w:p>
+            <w:pPr>
+              <w:jc w:val="left"/>
+            </w:pPr>
+            <w:r>
+              <w:rPr>
+                <w:rFonts w:ascii="Microsoft JhengHei" w:hAnsi="Microsoft JhengHei" w:eastAsia="Microsoft JhengHei"/>
+                <w:b w:val="0"/>
+                <w:color w:val="000000"/>
+                <w:sz w:val="28"/>
+              </w:rPr>
+              <w:t>來源是誰？</w:t>
+            </w:r>
+          </w:p>
+        </w:tc>
+        <w:tc>
+          <w:tcPr>
+            <w:tcW w:type="dxa" w:w="4989"/>
+            <w:tcBorders>
+              <w:top w:val="single" w:sz="10" w:space="0" w:color="000000"/>
+              <w:left w:val="single" w:sz="10" w:space="0" w:color="000000"/>
+              <w:bottom w:val="single" w:sz="10" w:space="0" w:color="000000"/>
+              <w:right w:val="single" w:sz="10" w:space="0" w:color="000000"/>
+              <w:insideH w:val="single" w:sz="10" w:space="0" w:color="000000"/>
+              <w:insideV w:val="single" w:sz="10" w:space="0" w:color="000000"/>
+            </w:tcBorders>
+            <w:shd w:fill="FFFFFF"/>
+            <w:tcMar>
+              <w:top w:w="130" w:type="dxa"/>
+              <w:start w:w="120" w:type="dxa"/>
+              <w:bottom w:w="130" w:type="dxa"/>
+              <w:end w:w="120" w:type="dxa"/>
+            </w:tcMar>
+            <w:vAlign w:val="center"/>
+          </w:tcPr>
+          <w:p>
+            <w:pPr>
+              <w:jc w:val="left"/>
+            </w:pPr>
+            <w:r>
+              <w:rPr>
+                <w:rFonts w:ascii="Microsoft JhengHei" w:hAnsi="Microsoft JhengHei" w:eastAsia="Microsoft JhengHei"/>
+                <w:b w:val="0"/>
+                <w:color w:val="000000"/>
+                <w:sz w:val="28"/>
+              </w:rPr>
+              <w:t>________________________________</w:t>
+            </w:r>
+          </w:p>
+        </w:tc>
+      </w:tr>
+      <w:tr>
+        <w:tc>
+          <w:tcPr>
+            <w:tcW w:type="dxa" w:w="4989"/>
+            <w:tcBorders>
+              <w:top w:val="single" w:sz="10" w:space="0" w:color="000000"/>
+              <w:left w:val="single" w:sz="10" w:space="0" w:color="000000"/>
+              <w:bottom w:val="single" w:sz="10" w:space="0" w:color="000000"/>
+              <w:right w:val="single" w:sz="10" w:space="0" w:color="000000"/>
+              <w:insideH w:val="single" w:sz="10" w:space="0" w:color="000000"/>
+              <w:insideV w:val="single" w:sz="10" w:space="0" w:color="000000"/>
+            </w:tcBorders>
+            <w:shd w:fill="FFFFFF"/>
+            <w:tcMar>
+              <w:top w:w="130" w:type="dxa"/>
+              <w:start w:w="120" w:type="dxa"/>
+              <w:bottom w:w="130" w:type="dxa"/>
+              <w:end w:w="120" w:type="dxa"/>
+            </w:tcMar>
+            <w:vAlign w:val="center"/>
+          </w:tcPr>
+          <w:p>
+            <w:pPr>
+              <w:jc w:val="left"/>
+            </w:pPr>
+            <w:r>
+              <w:rPr>
+                <w:rFonts w:ascii="Microsoft JhengHei" w:hAnsi="Microsoft JhengHei" w:eastAsia="Microsoft JhengHei"/>
+                <w:b w:val="0"/>
+                <w:color w:val="000000"/>
+                <w:sz w:val="28"/>
+              </w:rPr>
+              <w:t>日期和原始脈絡：</w:t>
+            </w:r>
+          </w:p>
+        </w:tc>
+        <w:tc>
+          <w:tcPr>
+            <w:tcW w:type="dxa" w:w="4989"/>
+            <w:tcBorders>
+              <w:top w:val="single" w:sz="10" w:space="0" w:color="000000"/>
+              <w:left w:val="single" w:sz="10" w:space="0" w:color="000000"/>
+              <w:bottom w:val="single" w:sz="10" w:space="0" w:color="000000"/>
+              <w:right w:val="single" w:sz="10" w:space="0" w:color="000000"/>
+              <w:insideH w:val="single" w:sz="10" w:space="0" w:color="000000"/>
+              <w:insideV w:val="single" w:sz="10" w:space="0" w:color="000000"/>
+            </w:tcBorders>
+            <w:shd w:fill="FFFFFF"/>
+            <w:tcMar>
+              <w:top w:w="130" w:type="dxa"/>
+              <w:start w:w="120" w:type="dxa"/>
+              <w:bottom w:w="130" w:type="dxa"/>
+              <w:end w:w="120" w:type="dxa"/>
+            </w:tcMar>
+            <w:vAlign w:val="center"/>
+          </w:tcPr>
+          <w:p>
+            <w:pPr>
+              <w:jc w:val="left"/>
+            </w:pPr>
+            <w:r>
+              <w:rPr>
+                <w:rFonts w:ascii="Microsoft JhengHei" w:hAnsi="Microsoft JhengHei" w:eastAsia="Microsoft JhengHei"/>
+                <w:b w:val="0"/>
+                <w:color w:val="000000"/>
+                <w:sz w:val="28"/>
+              </w:rPr>
+              <w:t>________________________________</w:t>
+            </w:r>
+          </w:p>
+        </w:tc>
+      </w:tr>
+      <w:tr>
+        <w:tc>
+          <w:tcPr>
+            <w:tcW w:type="dxa" w:w="4989"/>
+            <w:tcBorders>
+              <w:top w:val="single" w:sz="10" w:space="0" w:color="000000"/>
+              <w:left w:val="single" w:sz="10" w:space="0" w:color="000000"/>
+              <w:bottom w:val="single" w:sz="10" w:space="0" w:color="000000"/>
+              <w:right w:val="single" w:sz="10" w:space="0" w:color="000000"/>
+              <w:insideH w:val="single" w:sz="10" w:space="0" w:color="000000"/>
+              <w:insideV w:val="single" w:sz="10" w:space="0" w:color="000000"/>
+            </w:tcBorders>
+            <w:shd w:fill="FFFFFF"/>
+            <w:tcMar>
+              <w:top w:w="130" w:type="dxa"/>
+              <w:start w:w="120" w:type="dxa"/>
+              <w:bottom w:w="130" w:type="dxa"/>
+              <w:end w:w="120" w:type="dxa"/>
+            </w:tcMar>
+            <w:vAlign w:val="center"/>
+          </w:tcPr>
+          <w:p>
+            <w:pPr>
+              <w:jc w:val="left"/>
+            </w:pPr>
+            <w:r>
+              <w:rPr>
+                <w:rFonts w:ascii="Microsoft JhengHei" w:hAnsi="Microsoft JhengHei" w:eastAsia="Microsoft JhengHei"/>
+                <w:b w:val="0"/>
+                <w:color w:val="000000"/>
+                <w:sz w:val="28"/>
+              </w:rPr>
+              <w:t>有哪些證據？</w:t>
+            </w:r>
+          </w:p>
+        </w:tc>
+        <w:tc>
+          <w:tcPr>
+            <w:tcW w:type="dxa" w:w="4989"/>
+            <w:tcBorders>
+              <w:top w:val="single" w:sz="10" w:space="0" w:color="000000"/>
+              <w:left w:val="single" w:sz="10" w:space="0" w:color="000000"/>
+              <w:bottom w:val="single" w:sz="10" w:space="0" w:color="000000"/>
+              <w:right w:val="single" w:sz="10" w:space="0" w:color="000000"/>
+              <w:insideH w:val="single" w:sz="10" w:space="0" w:color="000000"/>
+              <w:insideV w:val="single" w:sz="10" w:space="0" w:color="000000"/>
+            </w:tcBorders>
+            <w:shd w:fill="FFFFFF"/>
+            <w:tcMar>
+              <w:top w:w="130" w:type="dxa"/>
+              <w:start w:w="120" w:type="dxa"/>
+              <w:bottom w:w="130" w:type="dxa"/>
+              <w:end w:w="120" w:type="dxa"/>
+            </w:tcMar>
+            <w:vAlign w:val="center"/>
+          </w:tcPr>
+          <w:p>
+            <w:pPr>
+              <w:jc w:val="left"/>
+            </w:pPr>
+            <w:r>
+              <w:rPr>
+                <w:rFonts w:ascii="Microsoft JhengHei" w:hAnsi="Microsoft JhengHei" w:eastAsia="Microsoft JhengHei"/>
+                <w:b w:val="0"/>
+                <w:color w:val="000000"/>
+                <w:sz w:val="28"/>
+              </w:rPr>
+              <w:t>________________________________</w:t>
+            </w:r>
+          </w:p>
+        </w:tc>
+      </w:tr>
+      <w:tr>
+        <w:tc>
+          <w:tcPr>
+            <w:tcW w:type="dxa" w:w="4989"/>
+            <w:tcBorders>
+              <w:top w:val="single" w:sz="10" w:space="0" w:color="000000"/>
+              <w:left w:val="single" w:sz="10" w:space="0" w:color="000000"/>
+              <w:bottom w:val="single" w:sz="10" w:space="0" w:color="000000"/>
+              <w:right w:val="single" w:sz="10" w:space="0" w:color="000000"/>
+              <w:insideH w:val="single" w:sz="10" w:space="0" w:color="000000"/>
+              <w:insideV w:val="single" w:sz="10" w:space="0" w:color="000000"/>
+            </w:tcBorders>
+            <w:shd w:fill="FFFFFF"/>
+            <w:tcMar>
+              <w:top w:w="130" w:type="dxa"/>
+              <w:start w:w="120" w:type="dxa"/>
+              <w:bottom w:w="130" w:type="dxa"/>
+              <w:end w:w="120" w:type="dxa"/>
+            </w:tcMar>
+            <w:vAlign w:val="center"/>
+          </w:tcPr>
+          <w:p>
+            <w:pPr>
+              <w:jc w:val="left"/>
+            </w:pPr>
+            <w:r>
+              <w:rPr>
+                <w:rFonts w:ascii="Microsoft JhengHei" w:hAnsi="Microsoft JhengHei" w:eastAsia="Microsoft JhengHei"/>
+                <w:b w:val="0"/>
+                <w:color w:val="000000"/>
+                <w:sz w:val="28"/>
+              </w:rPr>
+              <w:t>發布目的可能是什麼？</w:t>
+            </w:r>
+          </w:p>
+        </w:tc>
+        <w:tc>
+          <w:tcPr>
+            <w:tcW w:type="dxa" w:w="4989"/>
+            <w:tcBorders>
+              <w:top w:val="single" w:sz="10" w:space="0" w:color="000000"/>
+              <w:left w:val="single" w:sz="10" w:space="0" w:color="000000"/>
+              <w:bottom w:val="single" w:sz="10" w:space="0" w:color="000000"/>
+              <w:right w:val="single" w:sz="10" w:space="0" w:color="000000"/>
+              <w:insideH w:val="single" w:sz="10" w:space="0" w:color="000000"/>
+              <w:insideV w:val="single" w:sz="10" w:space="0" w:color="000000"/>
+            </w:tcBorders>
+            <w:shd w:fill="FFFFFF"/>
+            <w:tcMar>
+              <w:top w:w="130" w:type="dxa"/>
+              <w:start w:w="120" w:type="dxa"/>
+              <w:bottom w:w="130" w:type="dxa"/>
+              <w:end w:w="120" w:type="dxa"/>
+            </w:tcMar>
+            <w:vAlign w:val="center"/>
+          </w:tcPr>
+          <w:p>
+            <w:pPr>
+              <w:jc w:val="left"/>
+            </w:pPr>
+            <w:r>
+              <w:rPr>
+                <w:rFonts w:ascii="Microsoft JhengHei" w:hAnsi="Microsoft JhengHei" w:eastAsia="Microsoft JhengHei"/>
+                <w:b w:val="0"/>
+                <w:color w:val="000000"/>
+                <w:sz w:val="28"/>
+              </w:rPr>
+              <w:t>________________________________</w:t>
+            </w:r>
+          </w:p>
+        </w:tc>
+      </w:tr>
+      <w:tr>
+        <w:tc>
+          <w:tcPr>
+            <w:tcW w:type="dxa" w:w="4989"/>
+            <w:tcBorders>
+              <w:top w:val="single" w:sz="10" w:space="0" w:color="000000"/>
+              <w:left w:val="single" w:sz="10" w:space="0" w:color="000000"/>
+              <w:bottom w:val="single" w:sz="10" w:space="0" w:color="000000"/>
+              <w:right w:val="single" w:sz="10" w:space="0" w:color="000000"/>
+              <w:insideH w:val="single" w:sz="10" w:space="0" w:color="000000"/>
+              <w:insideV w:val="single" w:sz="10" w:space="0" w:color="000000"/>
+            </w:tcBorders>
+            <w:shd w:fill="FFFFFF"/>
+            <w:tcMar>
+              <w:top w:w="130" w:type="dxa"/>
+              <w:start w:w="120" w:type="dxa"/>
+              <w:bottom w:w="130" w:type="dxa"/>
+              <w:end w:w="120" w:type="dxa"/>
+            </w:tcMar>
+            <w:vAlign w:val="center"/>
+          </w:tcPr>
+          <w:p>
+            <w:pPr>
+              <w:jc w:val="left"/>
+            </w:pPr>
+            <w:r>
+              <w:rPr>
+                <w:rFonts w:ascii="Microsoft JhengHei" w:hAnsi="Microsoft JhengHei" w:eastAsia="Microsoft JhengHei"/>
+                <w:b w:val="0"/>
+                <w:color w:val="000000"/>
+                <w:sz w:val="28"/>
+              </w:rPr>
+              <w:t>我最後的決定：</w:t>
+            </w:r>
+          </w:p>
+        </w:tc>
+        <w:tc>
+          <w:tcPr>
+            <w:tcW w:type="dxa" w:w="4989"/>
+            <w:tcBorders>
+              <w:top w:val="single" w:sz="10" w:space="0" w:color="000000"/>
+              <w:left w:val="single" w:sz="10" w:space="0" w:color="000000"/>
+              <w:bottom w:val="single" w:sz="10" w:space="0" w:color="000000"/>
+              <w:right w:val="single" w:sz="10" w:space="0" w:color="000000"/>
+              <w:insideH w:val="single" w:sz="10" w:space="0" w:color="000000"/>
+              <w:insideV w:val="single" w:sz="10" w:space="0" w:color="000000"/>
+            </w:tcBorders>
+            <w:shd w:fill="FFFFFF"/>
+            <w:tcMar>
+              <w:top w:w="130" w:type="dxa"/>
+              <w:start w:w="120" w:type="dxa"/>
+              <w:bottom w:w="130" w:type="dxa"/>
+              <w:end w:w="120" w:type="dxa"/>
+            </w:tcMar>
+            <w:vAlign w:val="center"/>
+          </w:tcPr>
+          <w:p>
+            <w:pPr>
+              <w:jc w:val="left"/>
+            </w:pPr>
+            <w:r>
+              <w:rPr>
+                <w:rFonts w:ascii="Microsoft JhengHei" w:hAnsi="Microsoft JhengHei" w:eastAsia="Microsoft JhengHei"/>
+                <w:b w:val="0"/>
+                <w:color w:val="000000"/>
+                <w:sz w:val="28"/>
+              </w:rPr>
+              <w:t>□ 不轉傳　□ 再查證　□ 找大人確認</w:t>
+            </w:r>
+          </w:p>
+        </w:tc>
+      </w:tr>
+    </w:tbl>
+    <w:p/>
+    <w:tbl>
+      <w:tblPr>
+        <w:tblW w:type="auto" w:w="0"/>
+        <w:jc w:val="center"/>
+        <w:tblLayout w:type="fixed"/>
+        <w:tblLook w:firstColumn="1" w:firstRow="1" w:lastColumn="0" w:lastRow="0" w:noHBand="0" w:noVBand="1" w:val="04A0"/>
+      </w:tblPr>
+      <w:tblGrid>
+        <w:gridCol w:w="9978"/>
+      </w:tblGrid>
+      <w:tr>
+        <w:tc>
+          <w:tcPr>
+            <w:tcW w:type="dxa" w:w="9978"/>
+            <w:tcBorders>
+              <w:top w:val="single" w:sz="10" w:space="0" w:color="000000"/>
+              <w:left w:val="single" w:sz="10" w:space="0" w:color="000000"/>
+              <w:bottom w:val="single" w:sz="10" w:space="0" w:color="000000"/>
+              <w:right w:val="single" w:sz="10" w:space="0" w:color="000000"/>
+              <w:insideH w:val="single" w:sz="10" w:space="0" w:color="000000"/>
+              <w:insideV w:val="single" w:sz="10" w:space="0" w:color="000000"/>
+            </w:tcBorders>
+            <w:shd w:fill="FFFFFF"/>
+            <w:tcMar>
+              <w:top w:w="160" w:type="dxa"/>
+              <w:start w:w="180" w:type="dxa"/>
+              <w:bottom w:w="160" w:type="dxa"/>
+              <w:end w:w="180" w:type="dxa"/>
+            </w:tcMar>
+            <w:vAlign w:val="center"/>
+          </w:tcPr>
+          <w:p>
+            <w:pPr>
+              <w:spacing w:after="160"/>
+            </w:pPr>
+            <w:r>
+              <w:rPr>
+                <w:rFonts w:ascii="Microsoft JhengHei" w:hAnsi="Microsoft JhengHei" w:eastAsia="Microsoft JhengHei"/>
+                <w:b/>
+                <w:color w:val="000000"/>
+                <w:sz w:val="32"/>
+              </w:rPr>
+              <w:t>遇到可疑連結或個資要求，我的安全步驟</w:t>
+            </w:r>
+          </w:p>
+          <w:p>
+            <w:pPr>
+              <w:spacing w:after="120"/>
+            </w:pPr>
+            <w:r>
+              <w:rPr>
+                <w:rFonts w:ascii="Microsoft JhengHei" w:hAnsi="Microsoft JhengHei" w:eastAsia="Microsoft JhengHei"/>
+                <w:b w:val="0"/>
+                <w:color w:val="000000"/>
+                <w:sz w:val="28"/>
+              </w:rPr>
+              <w:t>________________________________________________________________________________</w:t>
+            </w:r>
+          </w:p>
+          <w:p>
+            <w:pPr>
+              <w:spacing w:after="120"/>
+            </w:pPr>
+            <w:r>
+              <w:rPr>
+                <w:rFonts w:ascii="Microsoft JhengHei" w:hAnsi="Microsoft JhengHei" w:eastAsia="Microsoft JhengHei"/>
+                <w:b w:val="0"/>
+                <w:color w:val="000000"/>
+                <w:sz w:val="28"/>
+              </w:rPr>
+              <w:t>________________________________________________________________________________</w:t>
+            </w:r>
+          </w:p>
+          <w:p>
+            <w:pPr>
+              <w:spacing w:after="120"/>
+            </w:pPr>
+            <w:r>
+              <w:rPr>
+                <w:rFonts w:ascii="Microsoft JhengHei" w:hAnsi="Microsoft JhengHei" w:eastAsia="Microsoft JhengHei"/>
+                <w:b w:val="0"/>
+                <w:color w:val="000000"/>
+                <w:sz w:val="28"/>
+              </w:rPr>
+              <w:t>________________________________________________________________________________</w:t>
+            </w:r>
+          </w:p>
+        </w:tc>
+      </w:tr>
+    </w:tbl>
+    <w:p>
+      <w:pPr>
+        <w:spacing w:after="40"/>
+      </w:pPr>
+    </w:p>
+    <w:p>
+      <w:r>
+        <w:br w:type="page"/>
+      </w:r>
+    </w:p>
+    <w:p>
+      <w:pPr>
+        <w:pStyle w:val="Heading1"/>
+      </w:pPr>
+      <w:r>
+        <w:t>壓力導航圖</w:t>
+      </w:r>
+    </w:p>
+    <w:p>
+      <w:r>
+        <w:rPr>
+          <w:rFonts w:ascii="Microsoft JhengHei" w:hAnsi="Microsoft JhengHei" w:eastAsia="Microsoft JhengHei"/>
+          <w:b w:val="0"/>
+          <w:color w:val="000000"/>
+          <w:sz w:val="28"/>
+        </w:rPr>
+        <w:t>把「我一定要全部做好」拆成現在做得到的一小步。</w:t>
+      </w:r>
+    </w:p>
+    <w:tbl>
+      <w:tblPr>
+        <w:tblW w:type="auto" w:w="0"/>
+        <w:jc w:val="center"/>
+        <w:tblLayout w:type="fixed"/>
+        <w:tblLook w:firstColumn="1" w:firstRow="1" w:lastColumn="0" w:lastRow="0" w:noHBand="0" w:noVBand="1" w:val="04A0"/>
+      </w:tblPr>
+      <w:tblGrid>
+        <w:gridCol w:w="4989"/>
+        <w:gridCol w:w="4989"/>
+      </w:tblGrid>
+      <w:tr>
+        <w:tc>
+          <w:tcPr>
+            <w:tcW w:type="dxa" w:w="4989"/>
+            <w:tcBorders>
+              <w:top w:val="single" w:sz="10" w:space="0" w:color="000000"/>
+              <w:left w:val="single" w:sz="10" w:space="0" w:color="000000"/>
+              <w:bottom w:val="single" w:sz="10" w:space="0" w:color="000000"/>
+              <w:right w:val="single" w:sz="10" w:space="0" w:color="000000"/>
+              <w:insideH w:val="single" w:sz="10" w:space="0" w:color="000000"/>
+              <w:insideV w:val="single" w:sz="10" w:space="0" w:color="000000"/>
+            </w:tcBorders>
+            <w:shd w:fill="F2F2F2"/>
+            <w:tcMar>
+              <w:top w:w="110" w:type="dxa"/>
+              <w:start w:w="120" w:type="dxa"/>
+              <w:bottom w:w="110" w:type="dxa"/>
+              <w:end w:w="120" w:type="dxa"/>
+            </w:tcMar>
+            <w:vAlign w:val="center"/>
+          </w:tcPr>
+          <w:p>
+            <w:pPr>
+              <w:jc w:val="center"/>
+            </w:pPr>
+            <w:r>
+              <w:rPr>
+                <w:rFonts w:ascii="Microsoft JhengHei" w:hAnsi="Microsoft JhengHei" w:eastAsia="Microsoft JhengHei"/>
+                <w:b/>
+                <w:color w:val="000000"/>
+                <w:sz w:val="28"/>
+              </w:rPr>
+              <w:t>導航問題</w:t>
+            </w:r>
+          </w:p>
+        </w:tc>
+        <w:tc>
+          <w:tcPr>
+            <w:tcW w:type="dxa" w:w="4989"/>
+            <w:tcBorders>
+              <w:top w:val="single" w:sz="10" w:space="0" w:color="000000"/>
+              <w:left w:val="single" w:sz="10" w:space="0" w:color="000000"/>
+              <w:bottom w:val="single" w:sz="10" w:space="0" w:color="000000"/>
+              <w:right w:val="single" w:sz="10" w:space="0" w:color="000000"/>
+              <w:insideH w:val="single" w:sz="10" w:space="0" w:color="000000"/>
+              <w:insideV w:val="single" w:sz="10" w:space="0" w:color="000000"/>
+            </w:tcBorders>
+            <w:shd w:fill="F2F2F2"/>
+            <w:tcMar>
+              <w:top w:w="110" w:type="dxa"/>
+              <w:start w:w="120" w:type="dxa"/>
+              <w:bottom w:w="110" w:type="dxa"/>
+              <w:end w:w="120" w:type="dxa"/>
+            </w:tcMar>
+            <w:vAlign w:val="center"/>
+          </w:tcPr>
+          <w:p>
+            <w:pPr>
+              <w:jc w:val="center"/>
+            </w:pPr>
+            <w:r>
+              <w:rPr>
+                <w:rFonts w:ascii="Microsoft JhengHei" w:hAnsi="Microsoft JhengHei" w:eastAsia="Microsoft JhengHei"/>
+                <w:b/>
+                <w:color w:val="000000"/>
+                <w:sz w:val="28"/>
+              </w:rPr>
+              <w:t>我的記錄</w:t>
+            </w:r>
+          </w:p>
+        </w:tc>
+      </w:tr>
+      <w:tr>
+        <w:tc>
+          <w:tcPr>
+            <w:tcW w:type="dxa" w:w="4989"/>
+            <w:tcBorders>
+              <w:top w:val="single" w:sz="10" w:space="0" w:color="000000"/>
+              <w:left w:val="single" w:sz="10" w:space="0" w:color="000000"/>
+              <w:bottom w:val="single" w:sz="10" w:space="0" w:color="000000"/>
+              <w:right w:val="single" w:sz="10" w:space="0" w:color="000000"/>
+              <w:insideH w:val="single" w:sz="10" w:space="0" w:color="000000"/>
+              <w:insideV w:val="single" w:sz="10" w:space="0" w:color="000000"/>
+            </w:tcBorders>
+            <w:shd w:fill="FFFFFF"/>
+            <w:tcMar>
+              <w:top w:w="130" w:type="dxa"/>
+              <w:start w:w="120" w:type="dxa"/>
+              <w:bottom w:w="130" w:type="dxa"/>
+              <w:end w:w="120" w:type="dxa"/>
+            </w:tcMar>
+            <w:vAlign w:val="center"/>
+          </w:tcPr>
+          <w:p>
+            <w:pPr>
+              <w:jc w:val="left"/>
+            </w:pPr>
+            <w:r>
+              <w:rPr>
+                <w:rFonts w:ascii="Microsoft JhengHei" w:hAnsi="Microsoft JhengHei" w:eastAsia="Microsoft JhengHei"/>
+                <w:b w:val="0"/>
+                <w:color w:val="000000"/>
+                <w:sz w:val="28"/>
+              </w:rPr>
+              <w:t>現在讓我有壓力的是：</w:t>
+            </w:r>
+          </w:p>
+        </w:tc>
+        <w:tc>
+          <w:tcPr>
+            <w:tcW w:type="dxa" w:w="4989"/>
+            <w:tcBorders>
+              <w:top w:val="single" w:sz="10" w:space="0" w:color="000000"/>
+              <w:left w:val="single" w:sz="10" w:space="0" w:color="000000"/>
+              <w:bottom w:val="single" w:sz="10" w:space="0" w:color="000000"/>
+              <w:right w:val="single" w:sz="10" w:space="0" w:color="000000"/>
+              <w:insideH w:val="single" w:sz="10" w:space="0" w:color="000000"/>
+              <w:insideV w:val="single" w:sz="10" w:space="0" w:color="000000"/>
+            </w:tcBorders>
+            <w:shd w:fill="FFFFFF"/>
+            <w:tcMar>
+              <w:top w:w="130" w:type="dxa"/>
+              <w:start w:w="120" w:type="dxa"/>
+              <w:bottom w:w="130" w:type="dxa"/>
+              <w:end w:w="120" w:type="dxa"/>
+            </w:tcMar>
+            <w:vAlign w:val="center"/>
+          </w:tcPr>
+          <w:p>
+            <w:pPr>
+              <w:jc w:val="left"/>
+            </w:pPr>
+            <w:r>
+              <w:rPr>
+                <w:rFonts w:ascii="Microsoft JhengHei" w:hAnsi="Microsoft JhengHei" w:eastAsia="Microsoft JhengHei"/>
+                <w:b w:val="0"/>
+                <w:color w:val="000000"/>
+                <w:sz w:val="28"/>
+              </w:rPr>
+              <w:t>________________________________</w:t>
+            </w:r>
+          </w:p>
+        </w:tc>
+      </w:tr>
+      <w:tr>
+        <w:tc>
+          <w:tcPr>
+            <w:tcW w:type="dxa" w:w="4989"/>
+            <w:tcBorders>
+              <w:top w:val="single" w:sz="10" w:space="0" w:color="000000"/>
+              <w:left w:val="single" w:sz="10" w:space="0" w:color="000000"/>
+              <w:bottom w:val="single" w:sz="10" w:space="0" w:color="000000"/>
+              <w:right w:val="single" w:sz="10" w:space="0" w:color="000000"/>
+              <w:insideH w:val="single" w:sz="10" w:space="0" w:color="000000"/>
+              <w:insideV w:val="single" w:sz="10" w:space="0" w:color="000000"/>
+            </w:tcBorders>
+            <w:shd w:fill="FFFFFF"/>
+            <w:tcMar>
+              <w:top w:w="130" w:type="dxa"/>
+              <w:start w:w="120" w:type="dxa"/>
+              <w:bottom w:w="130" w:type="dxa"/>
+              <w:end w:w="120" w:type="dxa"/>
+            </w:tcMar>
+            <w:vAlign w:val="center"/>
+          </w:tcPr>
+          <w:p>
+            <w:pPr>
+              <w:jc w:val="left"/>
+            </w:pPr>
+            <w:r>
+              <w:rPr>
+                <w:rFonts w:ascii="Microsoft JhengHei" w:hAnsi="Microsoft JhengHei" w:eastAsia="Microsoft JhengHei"/>
+                <w:b w:val="0"/>
+                <w:color w:val="000000"/>
+                <w:sz w:val="28"/>
+              </w:rPr>
+              <w:t>我能控制的部分：</w:t>
+            </w:r>
+          </w:p>
+        </w:tc>
+        <w:tc>
+          <w:tcPr>
+            <w:tcW w:type="dxa" w:w="4989"/>
+            <w:tcBorders>
+              <w:top w:val="single" w:sz="10" w:space="0" w:color="000000"/>
+              <w:left w:val="single" w:sz="10" w:space="0" w:color="000000"/>
+              <w:bottom w:val="single" w:sz="10" w:space="0" w:color="000000"/>
+              <w:right w:val="single" w:sz="10" w:space="0" w:color="000000"/>
+              <w:insideH w:val="single" w:sz="10" w:space="0" w:color="000000"/>
+              <w:insideV w:val="single" w:sz="10" w:space="0" w:color="000000"/>
+            </w:tcBorders>
+            <w:shd w:fill="FFFFFF"/>
+            <w:tcMar>
+              <w:top w:w="130" w:type="dxa"/>
+              <w:start w:w="120" w:type="dxa"/>
+              <w:bottom w:w="130" w:type="dxa"/>
+              <w:end w:w="120" w:type="dxa"/>
+            </w:tcMar>
+            <w:vAlign w:val="center"/>
+          </w:tcPr>
+          <w:p>
+            <w:pPr>
+              <w:jc w:val="left"/>
+            </w:pPr>
+            <w:r>
+              <w:rPr>
+                <w:rFonts w:ascii="Microsoft JhengHei" w:hAnsi="Microsoft JhengHei" w:eastAsia="Microsoft JhengHei"/>
+                <w:b w:val="0"/>
+                <w:color w:val="000000"/>
+                <w:sz w:val="28"/>
+              </w:rPr>
+              <w:t>________________________________</w:t>
+            </w:r>
+          </w:p>
+        </w:tc>
+      </w:tr>
+      <w:tr>
+        <w:tc>
+          <w:tcPr>
+            <w:tcW w:type="dxa" w:w="4989"/>
+            <w:tcBorders>
+              <w:top w:val="single" w:sz="10" w:space="0" w:color="000000"/>
+              <w:left w:val="single" w:sz="10" w:space="0" w:color="000000"/>
+              <w:bottom w:val="single" w:sz="10" w:space="0" w:color="000000"/>
+              <w:right w:val="single" w:sz="10" w:space="0" w:color="000000"/>
+              <w:insideH w:val="single" w:sz="10" w:space="0" w:color="000000"/>
+              <w:insideV w:val="single" w:sz="10" w:space="0" w:color="000000"/>
+            </w:tcBorders>
+            <w:shd w:fill="FFFFFF"/>
+            <w:tcMar>
+              <w:top w:w="130" w:type="dxa"/>
+              <w:start w:w="120" w:type="dxa"/>
+              <w:bottom w:w="130" w:type="dxa"/>
+              <w:end w:w="120" w:type="dxa"/>
+            </w:tcMar>
+            <w:vAlign w:val="center"/>
+          </w:tcPr>
+          <w:p>
+            <w:pPr>
+              <w:jc w:val="left"/>
+            </w:pPr>
+            <w:r>
+              <w:rPr>
+                <w:rFonts w:ascii="Microsoft JhengHei" w:hAnsi="Microsoft JhengHei" w:eastAsia="Microsoft JhengHei"/>
+                <w:b w:val="0"/>
+                <w:color w:val="000000"/>
+                <w:sz w:val="28"/>
+              </w:rPr>
+              <w:t>我今天先做的一小步：</w:t>
+            </w:r>
+          </w:p>
+        </w:tc>
+        <w:tc>
+          <w:tcPr>
+            <w:tcW w:type="dxa" w:w="4989"/>
+            <w:tcBorders>
+              <w:top w:val="single" w:sz="10" w:space="0" w:color="000000"/>
+              <w:left w:val="single" w:sz="10" w:space="0" w:color="000000"/>
+              <w:bottom w:val="single" w:sz="10" w:space="0" w:color="000000"/>
+              <w:right w:val="single" w:sz="10" w:space="0" w:color="000000"/>
+              <w:insideH w:val="single" w:sz="10" w:space="0" w:color="000000"/>
+              <w:insideV w:val="single" w:sz="10" w:space="0" w:color="000000"/>
+            </w:tcBorders>
+            <w:shd w:fill="FFFFFF"/>
+            <w:tcMar>
+              <w:top w:w="130" w:type="dxa"/>
+              <w:start w:w="120" w:type="dxa"/>
+              <w:bottom w:w="130" w:type="dxa"/>
+              <w:end w:w="120" w:type="dxa"/>
+            </w:tcMar>
+            <w:vAlign w:val="center"/>
+          </w:tcPr>
+          <w:p>
+            <w:pPr>
+              <w:jc w:val="left"/>
+            </w:pPr>
+            <w:r>
+              <w:rPr>
+                <w:rFonts w:ascii="Microsoft JhengHei" w:hAnsi="Microsoft JhengHei" w:eastAsia="Microsoft JhengHei"/>
+                <w:b w:val="0"/>
+                <w:color w:val="000000"/>
+                <w:sz w:val="28"/>
+              </w:rPr>
+              <w:t>________________________________</w:t>
+            </w:r>
+          </w:p>
+        </w:tc>
+      </w:tr>
+      <w:tr>
+        <w:tc>
+          <w:tcPr>
+            <w:tcW w:type="dxa" w:w="4989"/>
+            <w:tcBorders>
+              <w:top w:val="single" w:sz="10" w:space="0" w:color="000000"/>
+              <w:left w:val="single" w:sz="10" w:space="0" w:color="000000"/>
+              <w:bottom w:val="single" w:sz="10" w:space="0" w:color="000000"/>
+              <w:right w:val="single" w:sz="10" w:space="0" w:color="000000"/>
+              <w:insideH w:val="single" w:sz="10" w:space="0" w:color="000000"/>
+              <w:insideV w:val="single" w:sz="10" w:space="0" w:color="000000"/>
+            </w:tcBorders>
+            <w:shd w:fill="FFFFFF"/>
+            <w:tcMar>
+              <w:top w:w="130" w:type="dxa"/>
+              <w:start w:w="120" w:type="dxa"/>
+              <w:bottom w:w="130" w:type="dxa"/>
+              <w:end w:w="120" w:type="dxa"/>
+            </w:tcMar>
+            <w:vAlign w:val="center"/>
+          </w:tcPr>
+          <w:p>
+            <w:pPr>
+              <w:jc w:val="left"/>
+            </w:pPr>
+            <w:r>
+              <w:rPr>
+                <w:rFonts w:ascii="Microsoft JhengHei" w:hAnsi="Microsoft JhengHei" w:eastAsia="Microsoft JhengHei"/>
+                <w:b w:val="0"/>
+                <w:color w:val="000000"/>
+                <w:sz w:val="28"/>
+              </w:rPr>
+              <w:t>如果計畫被打斷，我的備案：</w:t>
+            </w:r>
+          </w:p>
+        </w:tc>
+        <w:tc>
+          <w:tcPr>
+            <w:tcW w:type="dxa" w:w="4989"/>
+            <w:tcBorders>
+              <w:top w:val="single" w:sz="10" w:space="0" w:color="000000"/>
+              <w:left w:val="single" w:sz="10" w:space="0" w:color="000000"/>
+              <w:bottom w:val="single" w:sz="10" w:space="0" w:color="000000"/>
+              <w:right w:val="single" w:sz="10" w:space="0" w:color="000000"/>
+              <w:insideH w:val="single" w:sz="10" w:space="0" w:color="000000"/>
+              <w:insideV w:val="single" w:sz="10" w:space="0" w:color="000000"/>
+            </w:tcBorders>
+            <w:shd w:fill="FFFFFF"/>
+            <w:tcMar>
+              <w:top w:w="130" w:type="dxa"/>
+              <w:start w:w="120" w:type="dxa"/>
+              <w:bottom w:w="130" w:type="dxa"/>
+              <w:end w:w="120" w:type="dxa"/>
+            </w:tcMar>
+            <w:vAlign w:val="center"/>
+          </w:tcPr>
+          <w:p>
+            <w:pPr>
+              <w:jc w:val="left"/>
+            </w:pPr>
+            <w:r>
+              <w:rPr>
+                <w:rFonts w:ascii="Microsoft JhengHei" w:hAnsi="Microsoft JhengHei" w:eastAsia="Microsoft JhengHei"/>
+                <w:b w:val="0"/>
+                <w:color w:val="000000"/>
+                <w:sz w:val="28"/>
+              </w:rPr>
+              <w:t>________________________________</w:t>
+            </w:r>
+          </w:p>
+        </w:tc>
+      </w:tr>
+      <w:tr>
+        <w:tc>
+          <w:tcPr>
+            <w:tcW w:type="dxa" w:w="4989"/>
+            <w:tcBorders>
+              <w:top w:val="single" w:sz="10" w:space="0" w:color="000000"/>
+              <w:left w:val="single" w:sz="10" w:space="0" w:color="000000"/>
+              <w:bottom w:val="single" w:sz="10" w:space="0" w:color="000000"/>
+              <w:right w:val="single" w:sz="10" w:space="0" w:color="000000"/>
+              <w:insideH w:val="single" w:sz="10" w:space="0" w:color="000000"/>
+              <w:insideV w:val="single" w:sz="10" w:space="0" w:color="000000"/>
+            </w:tcBorders>
+            <w:shd w:fill="FFFFFF"/>
+            <w:tcMar>
+              <w:top w:w="130" w:type="dxa"/>
+              <w:start w:w="120" w:type="dxa"/>
+              <w:bottom w:w="130" w:type="dxa"/>
+              <w:end w:w="120" w:type="dxa"/>
+            </w:tcMar>
+            <w:vAlign w:val="center"/>
+          </w:tcPr>
+          <w:p>
+            <w:pPr>
+              <w:jc w:val="left"/>
+            </w:pPr>
+            <w:r>
+              <w:rPr>
+                <w:rFonts w:ascii="Microsoft JhengHei" w:hAnsi="Microsoft JhengHei" w:eastAsia="Microsoft JhengHei"/>
+                <w:b w:val="0"/>
+                <w:color w:val="000000"/>
+                <w:sz w:val="28"/>
+              </w:rPr>
+              <w:t>我可以找誰支持我：</w:t>
+            </w:r>
+          </w:p>
+        </w:tc>
+        <w:tc>
+          <w:tcPr>
+            <w:tcW w:type="dxa" w:w="4989"/>
+            <w:tcBorders>
+              <w:top w:val="single" w:sz="10" w:space="0" w:color="000000"/>
+              <w:left w:val="single" w:sz="10" w:space="0" w:color="000000"/>
+              <w:bottom w:val="single" w:sz="10" w:space="0" w:color="000000"/>
+              <w:right w:val="single" w:sz="10" w:space="0" w:color="000000"/>
+              <w:insideH w:val="single" w:sz="10" w:space="0" w:color="000000"/>
+              <w:insideV w:val="single" w:sz="10" w:space="0" w:color="000000"/>
+            </w:tcBorders>
+            <w:shd w:fill="FFFFFF"/>
+            <w:tcMar>
+              <w:top w:w="130" w:type="dxa"/>
+              <w:start w:w="120" w:type="dxa"/>
+              <w:bottom w:w="130" w:type="dxa"/>
+              <w:end w:w="120" w:type="dxa"/>
+            </w:tcMar>
+            <w:vAlign w:val="center"/>
+          </w:tcPr>
+          <w:p>
+            <w:pPr>
+              <w:jc w:val="left"/>
+            </w:pPr>
+            <w:r>
+              <w:rPr>
+                <w:rFonts w:ascii="Microsoft JhengHei" w:hAnsi="Microsoft JhengHei" w:eastAsia="Microsoft JhengHei"/>
+                <w:b w:val="0"/>
+                <w:color w:val="000000"/>
+                <w:sz w:val="28"/>
+              </w:rPr>
+              <w:t>________________________________</w:t>
+            </w:r>
+          </w:p>
+        </w:tc>
+      </w:tr>
+    </w:tbl>
+    <w:p/>
+    <w:tbl>
+      <w:tblPr>
+        <w:tblW w:type="auto" w:w="0"/>
+        <w:jc w:val="center"/>
+        <w:tblLayout w:type="fixed"/>
+        <w:tblLook w:firstColumn="1" w:firstRow="1" w:lastColumn="0" w:lastRow="0" w:noHBand="0" w:noVBand="1" w:val="04A0"/>
+      </w:tblPr>
+      <w:tblGrid>
+        <w:gridCol w:w="9978"/>
+      </w:tblGrid>
+      <w:tr>
+        <w:tc>
+          <w:tcPr>
+            <w:tcW w:type="dxa" w:w="9978"/>
+            <w:tcBorders>
+              <w:top w:val="single" w:sz="10" w:space="0" w:color="000000"/>
+              <w:left w:val="single" w:sz="10" w:space="0" w:color="000000"/>
+              <w:bottom w:val="single" w:sz="10" w:space="0" w:color="000000"/>
+              <w:right w:val="single" w:sz="10" w:space="0" w:color="000000"/>
+              <w:insideH w:val="single" w:sz="10" w:space="0" w:color="000000"/>
+              <w:insideV w:val="single" w:sz="10" w:space="0" w:color="000000"/>
+            </w:tcBorders>
+            <w:shd w:fill="FFFFFF"/>
+            <w:tcMar>
+              <w:top w:w="160" w:type="dxa"/>
+              <w:start w:w="180" w:type="dxa"/>
+              <w:bottom w:w="160" w:type="dxa"/>
+              <w:end w:w="180" w:type="dxa"/>
+            </w:tcMar>
+            <w:vAlign w:val="center"/>
+          </w:tcPr>
+          <w:p>
+            <w:pPr>
+              <w:spacing w:after="160"/>
+            </w:pPr>
+            <w:r>
+              <w:rPr>
+                <w:rFonts w:ascii="Microsoft JhengHei" w:hAnsi="Microsoft JhengHei" w:eastAsia="Microsoft JhengHei"/>
+                <w:b/>
+                <w:color w:val="000000"/>
+                <w:sz w:val="32"/>
+              </w:rPr>
+              <w:t>我想對自己說的一句話</w:t>
+            </w:r>
+          </w:p>
+          <w:p>
+            <w:pPr>
+              <w:spacing w:after="120"/>
+            </w:pPr>
+            <w:r>
+              <w:rPr>
+                <w:rFonts w:ascii="Microsoft JhengHei" w:hAnsi="Microsoft JhengHei" w:eastAsia="Microsoft JhengHei"/>
+                <w:b w:val="0"/>
+                <w:color w:val="000000"/>
+                <w:sz w:val="28"/>
+              </w:rPr>
+              <w:t>________________________________________________________________________________</w:t>
+            </w:r>
+          </w:p>
+          <w:p>
+            <w:pPr>
+              <w:spacing w:after="120"/>
+            </w:pPr>
+            <w:r>
+              <w:rPr>
+                <w:rFonts w:ascii="Microsoft JhengHei" w:hAnsi="Microsoft JhengHei" w:eastAsia="Microsoft JhengHei"/>
+                <w:b w:val="0"/>
+                <w:color w:val="000000"/>
+                <w:sz w:val="28"/>
+              </w:rPr>
+              <w:t>________________________________________________________________________________</w:t>
+            </w:r>
+          </w:p>
+        </w:tc>
+      </w:tr>
+    </w:tbl>
+    <w:p>
+      <w:pPr>
+        <w:spacing w:after="40"/>
+      </w:pPr>
+    </w:p>
+    <w:p>
+      <w:r>
+        <w:br w:type="page"/>
+      </w:r>
+    </w:p>
+    <w:p>
+      <w:pPr>
+        <w:pStyle w:val="Heading1"/>
+      </w:pPr>
+      <w:r>
+        <w:t>課程回顧與下一站行動</w:t>
+      </w:r>
+    </w:p>
+    <w:p>
+      <w:r>
+        <w:rPr>
+          <w:rFonts w:ascii="Microsoft JhengHei" w:hAnsi="Microsoft JhengHei" w:eastAsia="Microsoft JhengHei"/>
+          <w:b w:val="0"/>
+          <w:color w:val="000000"/>
+          <w:sz w:val="28"/>
+        </w:rPr>
+        <w:t>回顧這段學習，選一個願意帶回生活的方法。</w:t>
+      </w:r>
+    </w:p>
+    <w:tbl>
+      <w:tblPr>
+        <w:tblW w:type="auto" w:w="0"/>
+        <w:jc w:val="center"/>
+        <w:tblLayout w:type="fixed"/>
+        <w:tblLook w:firstColumn="1" w:firstRow="1" w:lastColumn="0" w:lastRow="0" w:noHBand="0" w:noVBand="1" w:val="04A0"/>
+      </w:tblPr>
+      <w:tblGrid>
+        <w:gridCol w:w="4989"/>
+        <w:gridCol w:w="4989"/>
+      </w:tblGrid>
+      <w:tr>
+        <w:tc>
+          <w:tcPr>
+            <w:tcW w:type="dxa" w:w="3118"/>
+            <w:tcBorders>
+              <w:top w:val="single" w:sz="10" w:space="0" w:color="000000"/>
+              <w:left w:val="single" w:sz="10" w:space="0" w:color="000000"/>
+              <w:bottom w:val="single" w:sz="10" w:space="0" w:color="000000"/>
+              <w:right w:val="single" w:sz="10" w:space="0" w:color="000000"/>
+              <w:insideH w:val="single" w:sz="10" w:space="0" w:color="000000"/>
+              <w:insideV w:val="single" w:sz="10" w:space="0" w:color="000000"/>
+            </w:tcBorders>
+            <w:shd w:fill="F2F2F2"/>
+            <w:tcMar>
+              <w:top w:w="110" w:type="dxa"/>
+              <w:start w:w="120" w:type="dxa"/>
+              <w:bottom w:w="110" w:type="dxa"/>
+              <w:end w:w="120" w:type="dxa"/>
+            </w:tcMar>
+            <w:vAlign w:val="center"/>
+          </w:tcPr>
+          <w:p>
+            <w:pPr>
+              <w:jc w:val="center"/>
+            </w:pPr>
+            <w:r>
+              <w:rPr>
+                <w:rFonts w:ascii="Microsoft JhengHei" w:hAnsi="Microsoft JhengHei" w:eastAsia="Microsoft JhengHei"/>
+                <w:b/>
+                <w:color w:val="000000"/>
+                <w:sz w:val="28"/>
+              </w:rPr>
+              <w:t>我學到的能力</w:t>
+            </w:r>
+          </w:p>
+        </w:tc>
+        <w:tc>
+          <w:tcPr>
+            <w:tcW w:type="dxa" w:w="6860"/>
+            <w:tcBorders>
+              <w:top w:val="single" w:sz="10" w:space="0" w:color="000000"/>
+              <w:left w:val="single" w:sz="10" w:space="0" w:color="000000"/>
+              <w:bottom w:val="single" w:sz="10" w:space="0" w:color="000000"/>
+              <w:right w:val="single" w:sz="10" w:space="0" w:color="000000"/>
+              <w:insideH w:val="single" w:sz="10" w:space="0" w:color="000000"/>
+              <w:insideV w:val="single" w:sz="10" w:space="0" w:color="000000"/>
+            </w:tcBorders>
+            <w:shd w:fill="F2F2F2"/>
+            <w:tcMar>
+              <w:top w:w="110" w:type="dxa"/>
+              <w:start w:w="120" w:type="dxa"/>
+              <w:bottom w:w="110" w:type="dxa"/>
+              <w:end w:w="120" w:type="dxa"/>
+            </w:tcMar>
+            <w:vAlign w:val="center"/>
+          </w:tcPr>
+          <w:p>
+            <w:pPr>
+              <w:jc w:val="center"/>
+            </w:pPr>
+            <w:r>
+              <w:rPr>
+                <w:rFonts w:ascii="Microsoft JhengHei" w:hAnsi="Microsoft JhengHei" w:eastAsia="Microsoft JhengHei"/>
+                <w:b/>
+                <w:color w:val="000000"/>
+                <w:sz w:val="28"/>
+              </w:rPr>
+              <w:t>我可以怎麼使用</w:t>
+            </w:r>
+          </w:p>
+        </w:tc>
+      </w:tr>
+      <w:tr>
+        <w:tc>
+          <w:tcPr>
+            <w:tcW w:type="dxa" w:w="3118"/>
+            <w:tcBorders>
+              <w:top w:val="single" w:sz="10" w:space="0" w:color="000000"/>
+              <w:left w:val="single" w:sz="10" w:space="0" w:color="000000"/>
+              <w:bottom w:val="single" w:sz="10" w:space="0" w:color="000000"/>
+              <w:right w:val="single" w:sz="10" w:space="0" w:color="000000"/>
+              <w:insideH w:val="single" w:sz="10" w:space="0" w:color="000000"/>
+              <w:insideV w:val="single" w:sz="10" w:space="0" w:color="000000"/>
+            </w:tcBorders>
+            <w:shd w:fill="FFFFFF"/>
+            <w:tcMar>
+              <w:top w:w="130" w:type="dxa"/>
+              <w:start w:w="120" w:type="dxa"/>
+              <w:bottom w:w="130" w:type="dxa"/>
+              <w:end w:w="120" w:type="dxa"/>
+            </w:tcMar>
+            <w:vAlign w:val="center"/>
+          </w:tcPr>
+          <w:p>
+            <w:pPr>
+              <w:jc w:val="left"/>
+            </w:pPr>
+            <w:r>
+              <w:rPr>
+                <w:rFonts w:ascii="Microsoft JhengHei" w:hAnsi="Microsoft JhengHei" w:eastAsia="Microsoft JhengHei"/>
+                <w:b w:val="0"/>
+                <w:color w:val="000000"/>
+                <w:sz w:val="28"/>
+              </w:rPr>
+              <w:t>辨識</w:t>
+            </w:r>
+          </w:p>
+        </w:tc>
+        <w:tc>
+          <w:tcPr>
+            <w:tcW w:type="dxa" w:w="6860"/>
+            <w:tcBorders>
+              <w:top w:val="single" w:sz="10" w:space="0" w:color="000000"/>
+              <w:left w:val="single" w:sz="10" w:space="0" w:color="000000"/>
+              <w:bottom w:val="single" w:sz="10" w:space="0" w:color="000000"/>
+              <w:right w:val="single" w:sz="10" w:space="0" w:color="000000"/>
+              <w:insideH w:val="single" w:sz="10" w:space="0" w:color="000000"/>
+              <w:insideV w:val="single" w:sz="10" w:space="0" w:color="000000"/>
+            </w:tcBorders>
+            <w:shd w:fill="FFFFFF"/>
+            <w:tcMar>
+              <w:top w:w="130" w:type="dxa"/>
+              <w:start w:w="120" w:type="dxa"/>
+              <w:bottom w:w="130" w:type="dxa"/>
+              <w:end w:w="120" w:type="dxa"/>
+            </w:tcMar>
+            <w:vAlign w:val="center"/>
+          </w:tcPr>
+          <w:p>
+            <w:pPr>
+              <w:jc w:val="left"/>
+            </w:pPr>
+            <w:r>
+              <w:rPr>
+                <w:rFonts w:ascii="Microsoft JhengHei" w:hAnsi="Microsoft JhengHei" w:eastAsia="Microsoft JhengHei"/>
+                <w:b w:val="0"/>
+                <w:color w:val="000000"/>
+                <w:sz w:val="28"/>
+              </w:rPr>
+              <w:t>我能注意到：________________________</w:t>
+            </w:r>
+          </w:p>
+        </w:tc>
+      </w:tr>
+      <w:tr>
+        <w:tc>
+          <w:tcPr>
+            <w:tcW w:type="dxa" w:w="3118"/>
+            <w:tcBorders>
+              <w:top w:val="single" w:sz="10" w:space="0" w:color="000000"/>
+              <w:left w:val="single" w:sz="10" w:space="0" w:color="000000"/>
+              <w:bottom w:val="single" w:sz="10" w:space="0" w:color="000000"/>
+              <w:right w:val="single" w:sz="10" w:space="0" w:color="000000"/>
+              <w:insideH w:val="single" w:sz="10" w:space="0" w:color="000000"/>
+              <w:insideV w:val="single" w:sz="10" w:space="0" w:color="000000"/>
+            </w:tcBorders>
+            <w:shd w:fill="FFFFFF"/>
+            <w:tcMar>
+              <w:top w:w="130" w:type="dxa"/>
+              <w:start w:w="120" w:type="dxa"/>
+              <w:bottom w:w="130" w:type="dxa"/>
+              <w:end w:w="120" w:type="dxa"/>
+            </w:tcMar>
+            <w:vAlign w:val="center"/>
+          </w:tcPr>
+          <w:p>
+            <w:pPr>
+              <w:jc w:val="left"/>
+            </w:pPr>
+            <w:r>
+              <w:rPr>
+                <w:rFonts w:ascii="Microsoft JhengHei" w:hAnsi="Microsoft JhengHei" w:eastAsia="Microsoft JhengHei"/>
+                <w:b w:val="0"/>
+                <w:color w:val="000000"/>
+                <w:sz w:val="28"/>
+              </w:rPr>
+              <w:t>調節</w:t>
+            </w:r>
+          </w:p>
+        </w:tc>
+        <w:tc>
+          <w:tcPr>
+            <w:tcW w:type="dxa" w:w="6860"/>
+            <w:tcBorders>
+              <w:top w:val="single" w:sz="10" w:space="0" w:color="000000"/>
+              <w:left w:val="single" w:sz="10" w:space="0" w:color="000000"/>
+              <w:bottom w:val="single" w:sz="10" w:space="0" w:color="000000"/>
+              <w:right w:val="single" w:sz="10" w:space="0" w:color="000000"/>
+              <w:insideH w:val="single" w:sz="10" w:space="0" w:color="000000"/>
+              <w:insideV w:val="single" w:sz="10" w:space="0" w:color="000000"/>
+            </w:tcBorders>
+            <w:shd w:fill="FFFFFF"/>
+            <w:tcMar>
+              <w:top w:w="130" w:type="dxa"/>
+              <w:start w:w="120" w:type="dxa"/>
+              <w:bottom w:w="130" w:type="dxa"/>
+              <w:end w:w="120" w:type="dxa"/>
+            </w:tcMar>
+            <w:vAlign w:val="center"/>
+          </w:tcPr>
+          <w:p>
+            <w:pPr>
+              <w:jc w:val="left"/>
+            </w:pPr>
+            <w:r>
+              <w:rPr>
+                <w:rFonts w:ascii="Microsoft JhengHei" w:hAnsi="Microsoft JhengHei" w:eastAsia="Microsoft JhengHei"/>
+                <w:b w:val="0"/>
+                <w:color w:val="000000"/>
+                <w:sz w:val="28"/>
+              </w:rPr>
+              <w:t>我能先做：____________________________</w:t>
+            </w:r>
+          </w:p>
+        </w:tc>
+      </w:tr>
+      <w:tr>
+        <w:tc>
+          <w:tcPr>
+            <w:tcW w:type="dxa" w:w="3118"/>
+            <w:tcBorders>
+              <w:top w:val="single" w:sz="10" w:space="0" w:color="000000"/>
+              <w:left w:val="single" w:sz="10" w:space="0" w:color="000000"/>
+              <w:bottom w:val="single" w:sz="10" w:space="0" w:color="000000"/>
+              <w:right w:val="single" w:sz="10" w:space="0" w:color="000000"/>
+              <w:insideH w:val="single" w:sz="10" w:space="0" w:color="000000"/>
+              <w:insideV w:val="single" w:sz="10" w:space="0" w:color="000000"/>
+            </w:tcBorders>
+            <w:shd w:fill="FFFFFF"/>
+            <w:tcMar>
+              <w:top w:w="130" w:type="dxa"/>
+              <w:start w:w="120" w:type="dxa"/>
+              <w:bottom w:w="130" w:type="dxa"/>
+              <w:end w:w="120" w:type="dxa"/>
+            </w:tcMar>
+            <w:vAlign w:val="center"/>
+          </w:tcPr>
+          <w:p>
+            <w:pPr>
+              <w:jc w:val="left"/>
+            </w:pPr>
+            <w:r>
+              <w:rPr>
+                <w:rFonts w:ascii="Microsoft JhengHei" w:hAnsi="Microsoft JhengHei" w:eastAsia="Microsoft JhengHei"/>
+                <w:b w:val="0"/>
+                <w:color w:val="000000"/>
+                <w:sz w:val="28"/>
+              </w:rPr>
+              <w:t>求助</w:t>
+            </w:r>
+          </w:p>
+        </w:tc>
+        <w:tc>
+          <w:tcPr>
+            <w:tcW w:type="dxa" w:w="6860"/>
+            <w:tcBorders>
+              <w:top w:val="single" w:sz="10" w:space="0" w:color="000000"/>
+              <w:left w:val="single" w:sz="10" w:space="0" w:color="000000"/>
+              <w:bottom w:val="single" w:sz="10" w:space="0" w:color="000000"/>
+              <w:right w:val="single" w:sz="10" w:space="0" w:color="000000"/>
+              <w:insideH w:val="single" w:sz="10" w:space="0" w:color="000000"/>
+              <w:insideV w:val="single" w:sz="10" w:space="0" w:color="000000"/>
+            </w:tcBorders>
+            <w:shd w:fill="FFFFFF"/>
+            <w:tcMar>
+              <w:top w:w="130" w:type="dxa"/>
+              <w:start w:w="120" w:type="dxa"/>
+              <w:bottom w:w="130" w:type="dxa"/>
+              <w:end w:w="120" w:type="dxa"/>
+            </w:tcMar>
+            <w:vAlign w:val="center"/>
+          </w:tcPr>
+          <w:p>
+            <w:pPr>
+              <w:jc w:val="left"/>
+            </w:pPr>
+            <w:r>
+              <w:rPr>
+                <w:rFonts w:ascii="Microsoft JhengHei" w:hAnsi="Microsoft JhengHei" w:eastAsia="Microsoft JhengHei"/>
+                <w:b w:val="0"/>
+                <w:color w:val="000000"/>
+                <w:sz w:val="28"/>
+              </w:rPr>
+              <w:t>我能找：______________________________</w:t>
+            </w:r>
+          </w:p>
+        </w:tc>
+      </w:tr>
+      <w:tr>
+        <w:tc>
+          <w:tcPr>
+            <w:tcW w:type="dxa" w:w="3118"/>
+            <w:tcBorders>
+              <w:top w:val="single" w:sz="10" w:space="0" w:color="000000"/>
+              <w:left w:val="single" w:sz="10" w:space="0" w:color="000000"/>
+              <w:bottom w:val="single" w:sz="10" w:space="0" w:color="000000"/>
+              <w:right w:val="single" w:sz="10" w:space="0" w:color="000000"/>
+              <w:insideH w:val="single" w:sz="10" w:space="0" w:color="000000"/>
+              <w:insideV w:val="single" w:sz="10" w:space="0" w:color="000000"/>
+            </w:tcBorders>
+            <w:shd w:fill="FFFFFF"/>
+            <w:tcMar>
+              <w:top w:w="130" w:type="dxa"/>
+              <w:start w:w="120" w:type="dxa"/>
+              <w:bottom w:w="130" w:type="dxa"/>
+              <w:end w:w="120" w:type="dxa"/>
+            </w:tcMar>
+            <w:vAlign w:val="center"/>
+          </w:tcPr>
+          <w:p>
+            <w:pPr>
+              <w:jc w:val="left"/>
+            </w:pPr>
+            <w:r>
+              <w:rPr>
+                <w:rFonts w:ascii="Microsoft JhengHei" w:hAnsi="Microsoft JhengHei" w:eastAsia="Microsoft JhengHei"/>
+                <w:b w:val="0"/>
+                <w:color w:val="000000"/>
+                <w:sz w:val="28"/>
+              </w:rPr>
+              <w:t>行動</w:t>
+            </w:r>
+          </w:p>
+        </w:tc>
+        <w:tc>
+          <w:tcPr>
+            <w:tcW w:type="dxa" w:w="6860"/>
+            <w:tcBorders>
+              <w:top w:val="single" w:sz="10" w:space="0" w:color="000000"/>
+              <w:left w:val="single" w:sz="10" w:space="0" w:color="000000"/>
+              <w:bottom w:val="single" w:sz="10" w:space="0" w:color="000000"/>
+              <w:right w:val="single" w:sz="10" w:space="0" w:color="000000"/>
+              <w:insideH w:val="single" w:sz="10" w:space="0" w:color="000000"/>
+              <w:insideV w:val="single" w:sz="10" w:space="0" w:color="000000"/>
+            </w:tcBorders>
+            <w:shd w:fill="FFFFFF"/>
+            <w:tcMar>
+              <w:top w:w="130" w:type="dxa"/>
+              <w:start w:w="120" w:type="dxa"/>
+              <w:bottom w:w="130" w:type="dxa"/>
+              <w:end w:w="120" w:type="dxa"/>
+            </w:tcMar>
+            <w:vAlign w:val="center"/>
+          </w:tcPr>
+          <w:p>
+            <w:pPr>
+              <w:jc w:val="left"/>
+            </w:pPr>
+            <w:r>
+              <w:rPr>
+                <w:rFonts w:ascii="Microsoft JhengHei" w:hAnsi="Microsoft JhengHei" w:eastAsia="Microsoft JhengHei"/>
+                <w:b w:val="0"/>
+                <w:color w:val="000000"/>
+                <w:sz w:val="28"/>
+              </w:rPr>
+              <w:t>我明天先試：__________________________</w:t>
+            </w:r>
+          </w:p>
+        </w:tc>
+      </w:tr>
+    </w:tbl>
+    <w:p/>
+    <w:tbl>
+      <w:tblPr>
+        <w:tblW w:type="auto" w:w="0"/>
+        <w:jc w:val="center"/>
+        <w:tblLayout w:type="fixed"/>
+        <w:tblLook w:firstColumn="1" w:firstRow="1" w:lastColumn="0" w:lastRow="0" w:noHBand="0" w:noVBand="1" w:val="04A0"/>
+      </w:tblPr>
+      <w:tblGrid>
+        <w:gridCol w:w="4989"/>
+        <w:gridCol w:w="4989"/>
+      </w:tblGrid>
+      <w:tr>
+        <w:tc>
+          <w:tcPr>
+            <w:tcW w:type="dxa" w:w="3118"/>
+            <w:tcBorders>
+              <w:top w:val="single" w:sz="10" w:space="0" w:color="000000"/>
+              <w:left w:val="single" w:sz="10" w:space="0" w:color="000000"/>
+              <w:bottom w:val="single" w:sz="10" w:space="0" w:color="000000"/>
+              <w:right w:val="single" w:sz="10" w:space="0" w:color="000000"/>
+              <w:insideH w:val="single" w:sz="10" w:space="0" w:color="000000"/>
+              <w:insideV w:val="single" w:sz="10" w:space="0" w:color="000000"/>
+            </w:tcBorders>
+            <w:shd w:fill="F2F2F2"/>
+            <w:tcMar>
+              <w:top w:w="110" w:type="dxa"/>
+              <w:start w:w="120" w:type="dxa"/>
+              <w:bottom w:w="110" w:type="dxa"/>
+              <w:end w:w="120" w:type="dxa"/>
+            </w:tcMar>
+            <w:vAlign w:val="center"/>
+          </w:tcPr>
+          <w:p>
+            <w:pPr>
+              <w:jc w:val="center"/>
+            </w:pPr>
+            <w:r>
+              <w:rPr>
+                <w:rFonts w:ascii="Microsoft JhengHei" w:hAnsi="Microsoft JhengHei" w:eastAsia="Microsoft JhengHei"/>
+                <w:b/>
+                <w:color w:val="000000"/>
+                <w:sz w:val="28"/>
+              </w:rPr>
+              <w:t>我的行動卡</w:t>
+            </w:r>
+          </w:p>
+        </w:tc>
+        <w:tc>
+          <w:tcPr>
+            <w:tcW w:type="dxa" w:w="6860"/>
+            <w:tcBorders>
+              <w:top w:val="single" w:sz="10" w:space="0" w:color="000000"/>
+              <w:left w:val="single" w:sz="10" w:space="0" w:color="000000"/>
+              <w:bottom w:val="single" w:sz="10" w:space="0" w:color="000000"/>
+              <w:right w:val="single" w:sz="10" w:space="0" w:color="000000"/>
+              <w:insideH w:val="single" w:sz="10" w:space="0" w:color="000000"/>
+              <w:insideV w:val="single" w:sz="10" w:space="0" w:color="000000"/>
+            </w:tcBorders>
+            <w:shd w:fill="F2F2F2"/>
+            <w:tcMar>
+              <w:top w:w="110" w:type="dxa"/>
+              <w:start w:w="120" w:type="dxa"/>
+              <w:bottom w:w="110" w:type="dxa"/>
+              <w:end w:w="120" w:type="dxa"/>
+            </w:tcMar>
+            <w:vAlign w:val="center"/>
+          </w:tcPr>
+          <w:p>
+            <w:pPr>
+              <w:jc w:val="center"/>
+            </w:pPr>
+            <w:r>
+              <w:rPr>
+                <w:rFonts w:ascii="Microsoft JhengHei" w:hAnsi="Microsoft JhengHei" w:eastAsia="Microsoft JhengHei"/>
+                <w:b/>
+                <w:color w:val="000000"/>
+                <w:sz w:val="28"/>
+              </w:rPr>
+              <w:t>內容</w:t>
+            </w:r>
+          </w:p>
+        </w:tc>
+      </w:tr>
+      <w:tr>
+        <w:tc>
+          <w:tcPr>
+            <w:tcW w:type="dxa" w:w="3118"/>
+            <w:tcBorders>
+              <w:top w:val="single" w:sz="10" w:space="0" w:color="000000"/>
+              <w:left w:val="single" w:sz="10" w:space="0" w:color="000000"/>
+              <w:bottom w:val="single" w:sz="10" w:space="0" w:color="000000"/>
+              <w:right w:val="single" w:sz="10" w:space="0" w:color="000000"/>
+              <w:insideH w:val="single" w:sz="10" w:space="0" w:color="000000"/>
+              <w:insideV w:val="single" w:sz="10" w:space="0" w:color="000000"/>
+            </w:tcBorders>
+            <w:shd w:fill="FFFFFF"/>
+            <w:tcMar>
+              <w:top w:w="130" w:type="dxa"/>
+              <w:start w:w="120" w:type="dxa"/>
+              <w:bottom w:w="130" w:type="dxa"/>
+              <w:end w:w="120" w:type="dxa"/>
+            </w:tcMar>
+            <w:vAlign w:val="center"/>
+          </w:tcPr>
+          <w:p>
+            <w:pPr>
+              <w:jc w:val="left"/>
+            </w:pPr>
+            <w:r>
+              <w:rPr>
+                <w:rFonts w:ascii="Microsoft JhengHei" w:hAnsi="Microsoft JhengHei" w:eastAsia="Microsoft JhengHei"/>
+                <w:b w:val="0"/>
+                <w:color w:val="000000"/>
+                <w:sz w:val="28"/>
+              </w:rPr>
+              <w:t>開始時間</w:t>
+            </w:r>
+          </w:p>
+        </w:tc>
+        <w:tc>
+          <w:tcPr>
+            <w:tcW w:type="dxa" w:w="6860"/>
+            <w:tcBorders>
+              <w:top w:val="single" w:sz="10" w:space="0" w:color="000000"/>
+              <w:left w:val="single" w:sz="10" w:space="0" w:color="000000"/>
+              <w:bottom w:val="single" w:sz="10" w:space="0" w:color="000000"/>
+              <w:right w:val="single" w:sz="10" w:space="0" w:color="000000"/>
+              <w:insideH w:val="single" w:sz="10" w:space="0" w:color="000000"/>
+              <w:insideV w:val="single" w:sz="10" w:space="0" w:color="000000"/>
+            </w:tcBorders>
+            <w:shd w:fill="FFFFFF"/>
+            <w:tcMar>
+              <w:top w:w="130" w:type="dxa"/>
+              <w:start w:w="120" w:type="dxa"/>
+              <w:bottom w:w="130" w:type="dxa"/>
+              <w:end w:w="120" w:type="dxa"/>
+            </w:tcMar>
+            <w:vAlign w:val="center"/>
+          </w:tcPr>
+          <w:p>
+            <w:pPr>
+              <w:jc w:val="left"/>
+            </w:pPr>
+            <w:r>
+              <w:rPr>
+                <w:rFonts w:ascii="Microsoft JhengHei" w:hAnsi="Microsoft JhengHei" w:eastAsia="Microsoft JhengHei"/>
+                <w:b w:val="0"/>
+                <w:color w:val="000000"/>
+                <w:sz w:val="28"/>
+              </w:rPr>
+              <w:t>____________________________</w:t>
+            </w:r>
+          </w:p>
+        </w:tc>
+      </w:tr>
+      <w:tr>
+        <w:tc>
+          <w:tcPr>
+            <w:tcW w:type="dxa" w:w="3118"/>
+            <w:tcBorders>
+              <w:top w:val="single" w:sz="10" w:space="0" w:color="000000"/>
+              <w:left w:val="single" w:sz="10" w:space="0" w:color="000000"/>
+              <w:bottom w:val="single" w:sz="10" w:space="0" w:color="000000"/>
+              <w:right w:val="single" w:sz="10" w:space="0" w:color="000000"/>
+              <w:insideH w:val="single" w:sz="10" w:space="0" w:color="000000"/>
+              <w:insideV w:val="single" w:sz="10" w:space="0" w:color="000000"/>
+            </w:tcBorders>
+            <w:shd w:fill="FFFFFF"/>
+            <w:tcMar>
+              <w:top w:w="130" w:type="dxa"/>
+              <w:start w:w="120" w:type="dxa"/>
+              <w:bottom w:w="130" w:type="dxa"/>
+              <w:end w:w="120" w:type="dxa"/>
+            </w:tcMar>
+            <w:vAlign w:val="center"/>
+          </w:tcPr>
+          <w:p>
+            <w:pPr>
+              <w:jc w:val="left"/>
+            </w:pPr>
+            <w:r>
+              <w:rPr>
+                <w:rFonts w:ascii="Microsoft JhengHei" w:hAnsi="Microsoft JhengHei" w:eastAsia="Microsoft JhengHei"/>
+                <w:b w:val="0"/>
+                <w:color w:val="000000"/>
+                <w:sz w:val="28"/>
+              </w:rPr>
+              <w:t>支持者</w:t>
+            </w:r>
+          </w:p>
+        </w:tc>
+        <w:tc>
+          <w:tcPr>
+            <w:tcW w:type="dxa" w:w="6860"/>
+            <w:tcBorders>
+              <w:top w:val="single" w:sz="10" w:space="0" w:color="000000"/>
+              <w:left w:val="single" w:sz="10" w:space="0" w:color="000000"/>
+              <w:bottom w:val="single" w:sz="10" w:space="0" w:color="000000"/>
+              <w:right w:val="single" w:sz="10" w:space="0" w:color="000000"/>
+              <w:insideH w:val="single" w:sz="10" w:space="0" w:color="000000"/>
+              <w:insideV w:val="single" w:sz="10" w:space="0" w:color="000000"/>
+            </w:tcBorders>
+            <w:shd w:fill="FFFFFF"/>
+            <w:tcMar>
+              <w:top w:w="130" w:type="dxa"/>
+              <w:start w:w="120" w:type="dxa"/>
+              <w:bottom w:w="130" w:type="dxa"/>
+              <w:end w:w="120" w:type="dxa"/>
+            </w:tcMar>
+            <w:vAlign w:val="center"/>
+          </w:tcPr>
+          <w:p>
+            <w:pPr>
+              <w:jc w:val="left"/>
+            </w:pPr>
+            <w:r>
+              <w:rPr>
+                <w:rFonts w:ascii="Microsoft JhengHei" w:hAnsi="Microsoft JhengHei" w:eastAsia="Microsoft JhengHei"/>
+                <w:b w:val="0"/>
+                <w:color w:val="000000"/>
+                <w:sz w:val="28"/>
+              </w:rPr>
+              <w:t>____________________________</w:t>
+            </w:r>
+          </w:p>
+        </w:tc>
+      </w:tr>
+      <w:tr>
+        <w:tc>
+          <w:tcPr>
+            <w:tcW w:type="dxa" w:w="3118"/>
+            <w:tcBorders>
+              <w:top w:val="single" w:sz="10" w:space="0" w:color="000000"/>
+              <w:left w:val="single" w:sz="10" w:space="0" w:color="000000"/>
+              <w:bottom w:val="single" w:sz="10" w:space="0" w:color="000000"/>
+              <w:right w:val="single" w:sz="10" w:space="0" w:color="000000"/>
+              <w:insideH w:val="single" w:sz="10" w:space="0" w:color="000000"/>
+              <w:insideV w:val="single" w:sz="10" w:space="0" w:color="000000"/>
+            </w:tcBorders>
+            <w:shd w:fill="FFFFFF"/>
+            <w:tcMar>
+              <w:top w:w="130" w:type="dxa"/>
+              <w:start w:w="120" w:type="dxa"/>
+              <w:bottom w:w="130" w:type="dxa"/>
+              <w:end w:w="120" w:type="dxa"/>
+            </w:tcMar>
+            <w:vAlign w:val="center"/>
+          </w:tcPr>
+          <w:p>
+            <w:pPr>
+              <w:jc w:val="left"/>
+            </w:pPr>
+            <w:r>
+              <w:rPr>
+                <w:rFonts w:ascii="Microsoft JhengHei" w:hAnsi="Microsoft JhengHei" w:eastAsia="Microsoft JhengHei"/>
+                <w:b w:val="0"/>
+                <w:color w:val="000000"/>
+                <w:sz w:val="28"/>
+              </w:rPr>
+              <w:t>完成後的記錄方式</w:t>
+            </w:r>
+          </w:p>
+        </w:tc>
+        <w:tc>
+          <w:tcPr>
+            <w:tcW w:type="dxa" w:w="6860"/>
+            <w:tcBorders>
+              <w:top w:val="single" w:sz="10" w:space="0" w:color="000000"/>
+              <w:left w:val="single" w:sz="10" w:space="0" w:color="000000"/>
+              <w:bottom w:val="single" w:sz="10" w:space="0" w:color="000000"/>
+              <w:right w:val="single" w:sz="10" w:space="0" w:color="000000"/>
+              <w:insideH w:val="single" w:sz="10" w:space="0" w:color="000000"/>
+              <w:insideV w:val="single" w:sz="10" w:space="0" w:color="000000"/>
+            </w:tcBorders>
+            <w:shd w:fill="FFFFFF"/>
+            <w:tcMar>
+              <w:top w:w="130" w:type="dxa"/>
+              <w:start w:w="120" w:type="dxa"/>
+              <w:bottom w:w="130" w:type="dxa"/>
+              <w:end w:w="120" w:type="dxa"/>
+            </w:tcMar>
+            <w:vAlign w:val="center"/>
+          </w:tcPr>
+          <w:p>
+            <w:pPr>
+              <w:jc w:val="left"/>
+            </w:pPr>
+            <w:r>
+              <w:rPr>
+                <w:rFonts w:ascii="Microsoft JhengHei" w:hAnsi="Microsoft JhengHei" w:eastAsia="Microsoft JhengHei"/>
+                <w:b w:val="0"/>
+                <w:color w:val="000000"/>
+                <w:sz w:val="28"/>
+              </w:rPr>
+              <w:t>____________________________</w:t>
+            </w:r>
+          </w:p>
+        </w:tc>
+      </w:tr>
+    </w:tbl>
     <w:sectPr>
       <w:pgSz w:w="11906" w:h="16838"/>
       <w:pgMar w:top="907" w:right="964" w:bottom="907" w:left="964" w:header="720" w:footer="720" w:gutter="0"/>

</xml_diff>